<commit_message>
Title page: Leroy Louis Jean (33880212); Ostroleka PIS URL from Leroy's document; rebuild both versions
Co-Authored-By: Claude Opus 5.5 <noreply@anthropic.com>
Claude-Session: https://claude.ai/code/session_01SZLM437PwZArBFHgvvPCk4
</commit_message>
<xml_diff>
--- a/01_Report/MTE4593 Group 9 SMR Report - TEAM REVIEW.docx
+++ b/01_Report/MTE4593 Group 9 SMR Report - TEAM REVIEW.docx
@@ -232,40 +232,19 @@
         <w:t xml:space="preserve"> </w:t>
       </w:r>
       <w:r>
+        <w:t xml:space="preserve">Louis</w:t>
+      </w:r>
+      <w:r>
+        <w:t xml:space="preserve"> </w:t>
+      </w:r>
+      <w:r>
         <w:t xml:space="preserve">Jean</w:t>
       </w:r>
       <w:r>
         <w:t xml:space="preserve"> </w:t>
       </w:r>
       <w:r>
-        <w:rPr>
-          <w:rStyle w:val="TeamNote"/>
-        </w:rPr>
-        <w:t xml:space="preserve">ADD</w:t>
-      </w:r>
-      <w:r>
-        <w:rPr>
-          <w:rStyle w:val="TeamNote"/>
-        </w:rPr>
-        <w:t xml:space="preserve"> </w:t>
-      </w:r>
-      <w:r>
-        <w:rPr>
-          <w:rStyle w:val="TeamNote"/>
-        </w:rPr>
-        <w:t xml:space="preserve">STUDENT</w:t>
-      </w:r>
-      <w:r>
-        <w:rPr>
-          <w:rStyle w:val="TeamNote"/>
-        </w:rPr>
-        <w:t xml:space="preserve"> </w:t>
-      </w:r>
-      <w:r>
-        <w:rPr>
-          <w:rStyle w:val="TeamNote"/>
-        </w:rPr>
-        <w:t xml:space="preserve">ID</w:t>
+        <w:t xml:space="preserve">(33880212)</w:t>
       </w:r>
     </w:p>
     <w:p>
@@ -416,7 +395,7 @@
         <w:pStyle w:val="Compact"/>
       </w:pPr>
       <w:r>
-        <w:t xml:space="preserve">Title page: your student ID; Sam, your surname.</w:t>
+        <w:t xml:space="preserve">Title page: Victor’s and Sam’s student IDs; Sam’s surname (Leroy’s is in).</w:t>
       </w:r>
     </w:p>
     <w:p>
@@ -9500,7 +9479,7 @@
         <w:t xml:space="preserve">Small Modular Nuclear Power Plant: Project Information Sheet</w:t>
       </w:r>
       <w:r>
-        <w:t xml:space="preserve">. Table 14, p. 83.</w:t>
+        <w:t xml:space="preserve">. [pdf] Table 14, p. 83. Available at: https://am.lrv.lt/media/viesa/saugykla/2024/2/oHCKCUp7Lrs.pdf</w:t>
       </w:r>
     </w:p>
     <w:p>

</xml_diff>

<commit_message>
Contents on one page with the full Discussion breakdown: short Title Case headings, reference sub-headings as bold text, tighter contents spacing
Co-Authored-By: Claude Opus 5.5 <noreply@anthropic.com>
Claude-Session: https://claude.ai/code/session_01SZLM437PwZArBFHgvvPCk4
</commit_message>
<xml_diff>
--- a/01_Report/MTE4593 Group 9 SMR Report - TEAM REVIEW.docx
+++ b/01_Report/MTE4593 Group 9 SMR Report - TEAM REVIEW.docx
@@ -331,7 +331,7 @@
               <w:webHidden/>
               <w:rStyle w:val="IndexLink"/>
             </w:rPr>
-            <w:instrText xml:space="preserve"> TOC \z \o "1-2" \u \h</w:instrText>
+            <w:instrText xml:space="preserve"> TOC \z \o "1-3" \u \h</w:instrText>
           </w:r>
           <w:r>
             <w:rPr>
@@ -466,6 +466,101 @@
         </w:p>
         <w:p>
           <w:pPr>
+            <w:pStyle w:val="TOC3"/>
+            <w:tabs>
+              <w:tab w:val="clear" w:pos="9026"/>
+              <w:tab w:val="right" w:pos="9025" w:leader="dot"/>
+            </w:tabs>
+            <w:rPr/>
+          </w:pPr>
+          <w:r>
+            <w:rPr>
+              <w:webHidden/>
+              <w:rStyle w:val="IndexLink"/>
+            </w:rPr>
+            <w:t>3.1.1 Current Projects and Patents</w:t>
+            <w:tab/>
+            <w:t>5</w:t>
+          </w:r>
+        </w:p>
+        <w:p>
+          <w:pPr>
+            <w:pStyle w:val="TOC3"/>
+            <w:tabs>
+              <w:tab w:val="clear" w:pos="9026"/>
+              <w:tab w:val="right" w:pos="9025" w:leader="dot"/>
+            </w:tabs>
+            <w:rPr/>
+          </w:pPr>
+          <w:r>
+            <w:rPr>
+              <w:webHidden/>
+              <w:rStyle w:val="IndexLink"/>
+            </w:rPr>
+            <w:t>3.1.2 Technical Descriptions</w:t>
+            <w:tab/>
+            <w:t>6</w:t>
+          </w:r>
+        </w:p>
+        <w:p>
+          <w:pPr>
+            <w:pStyle w:val="TOC3"/>
+            <w:tabs>
+              <w:tab w:val="clear" w:pos="9026"/>
+              <w:tab w:val="right" w:pos="9025" w:leader="dot"/>
+            </w:tabs>
+            <w:rPr/>
+          </w:pPr>
+          <w:r>
+            <w:rPr>
+              <w:webHidden/>
+              <w:rStyle w:val="IndexLink"/>
+            </w:rPr>
+            <w:t>3.1.3 Barriers to Emissions Reduction</w:t>
+            <w:tab/>
+            <w:t>7</w:t>
+          </w:r>
+        </w:p>
+        <w:p>
+          <w:pPr>
+            <w:pStyle w:val="TOC3"/>
+            <w:tabs>
+              <w:tab w:val="clear" w:pos="9026"/>
+              <w:tab w:val="right" w:pos="9025" w:leader="dot"/>
+            </w:tabs>
+            <w:rPr/>
+          </w:pPr>
+          <w:r>
+            <w:rPr>
+              <w:webHidden/>
+              <w:rStyle w:val="IndexLink"/>
+            </w:rPr>
+            <w:t>3.1.4 The Proposed Initiative</w:t>
+            <w:tab/>
+            <w:t>8</w:t>
+          </w:r>
+        </w:p>
+        <w:p>
+          <w:pPr>
+            <w:pStyle w:val="TOC3"/>
+            <w:tabs>
+              <w:tab w:val="clear" w:pos="9026"/>
+              <w:tab w:val="right" w:pos="9025" w:leader="dot"/>
+            </w:tabs>
+            <w:rPr/>
+          </w:pPr>
+          <w:r>
+            <w:rPr>
+              <w:webHidden/>
+              <w:rStyle w:val="IndexLink"/>
+            </w:rPr>
+            <w:t>3.1.5 Materials from Extraction to End-of-Life</w:t>
+            <w:tab/>
+            <w:t>9</w:t>
+          </w:r>
+        </w:p>
+        <w:p>
+          <w:pPr>
             <w:pStyle w:val="TOC2"/>
             <w:tabs>
               <w:tab w:val="clear" w:pos="9026"/>
@@ -485,6 +580,101 @@
         </w:p>
         <w:p>
           <w:pPr>
+            <w:pStyle w:val="TOC3"/>
+            <w:tabs>
+              <w:tab w:val="clear" w:pos="9026"/>
+              <w:tab w:val="right" w:pos="9025" w:leader="dot"/>
+            </w:tabs>
+            <w:rPr/>
+          </w:pPr>
+          <w:r>
+            <w:rPr>
+              <w:webHidden/>
+              <w:rStyle w:val="IndexLink"/>
+            </w:rPr>
+            <w:t>3.2.1 Goal, Scope and Method</w:t>
+            <w:tab/>
+            <w:t>10</w:t>
+          </w:r>
+        </w:p>
+        <w:p>
+          <w:pPr>
+            <w:pStyle w:val="TOC3"/>
+            <w:tabs>
+              <w:tab w:val="clear" w:pos="9026"/>
+              <w:tab w:val="right" w:pos="9025" w:leader="dot"/>
+            </w:tabs>
+            <w:rPr/>
+          </w:pPr>
+          <w:r>
+            <w:rPr>
+              <w:webHidden/>
+              <w:rStyle w:val="IndexLink"/>
+            </w:rPr>
+            <w:t>3.2.2 Baseline and Hotspots</w:t>
+            <w:tab/>
+            <w:t>11</w:t>
+          </w:r>
+        </w:p>
+        <w:p>
+          <w:pPr>
+            <w:pStyle w:val="TOC3"/>
+            <w:tabs>
+              <w:tab w:val="clear" w:pos="9026"/>
+              <w:tab w:val="right" w:pos="9025" w:leader="dot"/>
+            </w:tabs>
+            <w:rPr/>
+          </w:pPr>
+          <w:r>
+            <w:rPr>
+              <w:webHidden/>
+              <w:rStyle w:val="IndexLink"/>
+            </w:rPr>
+            <w:t>3.2.3 The Initiative against the Baseline</w:t>
+            <w:tab/>
+            <w:t>12</w:t>
+          </w:r>
+        </w:p>
+        <w:p>
+          <w:pPr>
+            <w:pStyle w:val="TOC3"/>
+            <w:tabs>
+              <w:tab w:val="clear" w:pos="9026"/>
+              <w:tab w:val="right" w:pos="9025" w:leader="dot"/>
+            </w:tabs>
+            <w:rPr/>
+          </w:pPr>
+          <w:r>
+            <w:rPr>
+              <w:webHidden/>
+              <w:rStyle w:val="IndexLink"/>
+            </w:rPr>
+            <w:t>3.2.4 Uncertainty Analysis</w:t>
+            <w:tab/>
+            <w:t>13</w:t>
+          </w:r>
+        </w:p>
+        <w:p>
+          <w:pPr>
+            <w:pStyle w:val="TOC3"/>
+            <w:tabs>
+              <w:tab w:val="clear" w:pos="9026"/>
+              <w:tab w:val="right" w:pos="9025" w:leader="dot"/>
+            </w:tabs>
+            <w:rPr/>
+          </w:pPr>
+          <w:r>
+            <w:rPr>
+              <w:webHidden/>
+              <w:rStyle w:val="IndexLink"/>
+            </w:rPr>
+            <w:t>3.2.5 Comparison with Published Values</w:t>
+            <w:tab/>
+            <w:t>14</w:t>
+          </w:r>
+        </w:p>
+        <w:p>
+          <w:pPr>
             <w:pStyle w:val="TOC2"/>
             <w:tabs>
               <w:tab w:val="clear" w:pos="9026"/>
@@ -497,9 +687,66 @@
               <w:webHidden/>
               <w:rStyle w:val="IndexLink"/>
             </w:rPr>
-            <w:t>3.3 National Strategies and Industrial Policies: Carbon Avoided in Ontario and Australia</w:t>
+            <w:t>3.3 National Strategies and Industrial Policies</w:t>
             <w:tab/>
             <w:t>15</w:t>
+          </w:r>
+        </w:p>
+        <w:p>
+          <w:pPr>
+            <w:pStyle w:val="TOC3"/>
+            <w:tabs>
+              <w:tab w:val="clear" w:pos="9026"/>
+              <w:tab w:val="right" w:pos="9025" w:leader="dot"/>
+            </w:tabs>
+            <w:rPr/>
+          </w:pPr>
+          <w:r>
+            <w:rPr>
+              <w:webHidden/>
+              <w:rStyle w:val="IndexLink"/>
+            </w:rPr>
+            <w:t>3.3.1 The Value of Schedule</w:t>
+            <w:tab/>
+            <w:t>15</w:t>
+          </w:r>
+        </w:p>
+        <w:p>
+          <w:pPr>
+            <w:pStyle w:val="TOC3"/>
+            <w:tabs>
+              <w:tab w:val="clear" w:pos="9026"/>
+              <w:tab w:val="right" w:pos="9025" w:leader="dot"/>
+            </w:tabs>
+            <w:rPr/>
+          </w:pPr>
+          <w:r>
+            <w:rPr>
+              <w:webHidden/>
+              <w:rStyle w:val="IndexLink"/>
+            </w:rPr>
+            <w:t>3.3.2 Carbon Displaced: Darlington vs Liddell</w:t>
+            <w:tab/>
+            <w:t>16</w:t>
+          </w:r>
+        </w:p>
+        <w:p>
+          <w:pPr>
+            <w:pStyle w:val="TOC3"/>
+            <w:tabs>
+              <w:tab w:val="clear" w:pos="9026"/>
+              <w:tab w:val="right" w:pos="9025" w:leader="dot"/>
+            </w:tabs>
+            <w:rPr/>
+          </w:pPr>
+          <w:r>
+            <w:rPr>
+              <w:webHidden/>
+              <w:rStyle w:val="IndexLink"/>
+            </w:rPr>
+            <w:t>3.3.3 Firmed Renewables for the Same Money</w:t>
+            <w:tab/>
+            <w:t>17</w:t>
           </w:r>
         </w:p>
         <w:p>
@@ -523,6 +770,44 @@
         </w:p>
         <w:p>
           <w:pPr>
+            <w:pStyle w:val="TOC3"/>
+            <w:tabs>
+              <w:tab w:val="clear" w:pos="9026"/>
+              <w:tab w:val="right" w:pos="9025" w:leader="dot"/>
+            </w:tabs>
+            <w:rPr/>
+          </w:pPr>
+          <w:r>
+            <w:rPr>
+              <w:webHidden/>
+              <w:rStyle w:val="IndexLink"/>
+            </w:rPr>
+            <w:t>3.4.1 Stakeholders and Money Flows</w:t>
+            <w:tab/>
+            <w:t>17</w:t>
+          </w:r>
+        </w:p>
+        <w:p>
+          <w:pPr>
+            <w:pStyle w:val="TOC3"/>
+            <w:tabs>
+              <w:tab w:val="clear" w:pos="9026"/>
+              <w:tab w:val="right" w:pos="9025" w:leader="dot"/>
+            </w:tabs>
+            <w:rPr/>
+          </w:pPr>
+          <w:r>
+            <w:rPr>
+              <w:webHidden/>
+              <w:rStyle w:val="IndexLink"/>
+            </w:rPr>
+            <w:t>3.4.2 Social Licence</w:t>
+            <w:tab/>
+            <w:t>19</w:t>
+          </w:r>
+        </w:p>
+        <w:p>
+          <w:pPr>
             <w:pStyle w:val="TOC2"/>
             <w:tabs>
               <w:tab w:val="clear" w:pos="9026"/>
@@ -538,6 +823,44 @@
             <w:t>3.5 Market Analysis and Economic Feasibility</w:t>
             <w:tab/>
             <w:t>21</w:t>
+          </w:r>
+        </w:p>
+        <w:p>
+          <w:pPr>
+            <w:pStyle w:val="TOC3"/>
+            <w:tabs>
+              <w:tab w:val="clear" w:pos="9026"/>
+              <w:tab w:val="right" w:pos="9025" w:leader="dot"/>
+            </w:tabs>
+            <w:rPr/>
+          </w:pPr>
+          <w:r>
+            <w:rPr>
+              <w:webHidden/>
+              <w:rStyle w:val="IndexLink"/>
+            </w:rPr>
+            <w:t>3.5.1 Economics, Finance and Market Barriers</w:t>
+            <w:tab/>
+            <w:t>21</w:t>
+          </w:r>
+        </w:p>
+        <w:p>
+          <w:pPr>
+            <w:pStyle w:val="TOC3"/>
+            <w:tabs>
+              <w:tab w:val="clear" w:pos="9026"/>
+              <w:tab w:val="right" w:pos="9025" w:leader="dot"/>
+            </w:tabs>
+            <w:rPr/>
+          </w:pPr>
+          <w:r>
+            <w:rPr>
+              <w:webHidden/>
+              <w:rStyle w:val="IndexLink"/>
+            </w:rPr>
+            <w:t>3.5.2 Supply Concentration and Geopolitics</w:t>
+            <w:tab/>
+            <w:t>23</w:t>
           </w:r>
         </w:p>
         <w:p>
@@ -561,7 +884,7 @@
         </w:p>
         <w:p>
           <w:pPr>
-            <w:pStyle w:val="TOC2"/>
+            <w:pStyle w:val="TOC3"/>
             <w:tabs>
               <w:tab w:val="clear" w:pos="9026"/>
               <w:tab w:val="right" w:pos="9025" w:leader="dot"/>
@@ -573,9 +896,28 @@
               <w:webHidden/>
               <w:rStyle w:val="IndexLink"/>
             </w:rPr>
-            <w:t>3.7 Triple-bottom-line evaluation and multi-criteria analysis</w:t>
+            <w:t>3.6.1 Law, Regulation and Licensing</w:t>
             <w:tab/>
-            <w:t>27</w:t>
+            <w:t>24</w:t>
+          </w:r>
+        </w:p>
+        <w:p>
+          <w:pPr>
+            <w:pStyle w:val="TOC3"/>
+            <w:tabs>
+              <w:tab w:val="clear" w:pos="9026"/>
+              <w:tab w:val="right" w:pos="9025" w:leader="dot"/>
+            </w:tabs>
+            <w:rPr/>
+          </w:pPr>
+          <w:r>
+            <w:rPr>
+              <w:webHidden/>
+              <w:rStyle w:val="IndexLink"/>
+            </w:rPr>
+            <w:t>3.6.2 Implementation Pathway</w:t>
+            <w:tab/>
+            <w:t>25</w:t>
           </w:r>
         </w:p>
         <w:p>
@@ -592,7 +934,83 @@
               <w:webHidden/>
               <w:rStyle w:val="IndexLink"/>
             </w:rPr>
-            <w:t>3.8 Future material properties and processes</w:t>
+            <w:t>3.7 Triple Bottom Line and Multi-Criteria Analysis</w:t>
+            <w:tab/>
+            <w:t>27</w:t>
+          </w:r>
+        </w:p>
+        <w:p>
+          <w:pPr>
+            <w:pStyle w:val="TOC3"/>
+            <w:tabs>
+              <w:tab w:val="clear" w:pos="9026"/>
+              <w:tab w:val="right" w:pos="9025" w:leader="dot"/>
+            </w:tabs>
+            <w:rPr/>
+          </w:pPr>
+          <w:r>
+            <w:rPr>
+              <w:webHidden/>
+              <w:rStyle w:val="IndexLink"/>
+            </w:rPr>
+            <w:t>3.7.1 Triple Bottom Line</w:t>
+            <w:tab/>
+            <w:t>27</w:t>
+          </w:r>
+        </w:p>
+        <w:p>
+          <w:pPr>
+            <w:pStyle w:val="TOC3"/>
+            <w:tabs>
+              <w:tab w:val="clear" w:pos="9026"/>
+              <w:tab w:val="right" w:pos="9025" w:leader="dot"/>
+            </w:tabs>
+            <w:rPr/>
+          </w:pPr>
+          <w:r>
+            <w:rPr>
+              <w:webHidden/>
+              <w:rStyle w:val="IndexLink"/>
+            </w:rPr>
+            <w:t>3.7.2 Multi-Criteria Analysis</w:t>
+            <w:tab/>
+            <w:t>28</w:t>
+          </w:r>
+        </w:p>
+        <w:p>
+          <w:pPr>
+            <w:pStyle w:val="TOC3"/>
+            <w:tabs>
+              <w:tab w:val="clear" w:pos="9026"/>
+              <w:tab w:val="right" w:pos="9025" w:leader="dot"/>
+            </w:tabs>
+            <w:rPr/>
+          </w:pPr>
+          <w:r>
+            <w:rPr>
+              <w:webHidden/>
+              <w:rStyle w:val="IndexLink"/>
+            </w:rPr>
+            <w:t>3.7.3 Verdict and Limits</w:t>
+            <w:tab/>
+            <w:t>29</w:t>
+          </w:r>
+        </w:p>
+        <w:p>
+          <w:pPr>
+            <w:pStyle w:val="TOC2"/>
+            <w:tabs>
+              <w:tab w:val="clear" w:pos="9026"/>
+              <w:tab w:val="right" w:pos="9025" w:leader="dot"/>
+            </w:tabs>
+            <w:rPr/>
+          </w:pPr>
+          <w:r>
+            <w:rPr>
+              <w:webHidden/>
+              <w:rStyle w:val="IndexLink"/>
+            </w:rPr>
+            <w:t>3.8 Future Material Properties and Processes</w:t>
             <w:tab/>
             <w:t>29</w:t>
           </w:r>
@@ -2161,7 +2579,7 @@
       </w:pPr>
       <w:r>
         <w:rPr/>
-        <w:t>3.1.2 Technical Descriptions: the BWRX-300 at Darlington</w:t>
+        <w:t>3.1.2 Technical Descriptions</w:t>
       </w:r>
     </w:p>
     <w:p>
@@ -2191,7 +2609,7 @@
       </w:pPr>
       <w:r>
         <w:rPr/>
-        <w:t>3.1.3 Barriers to cutting emissions with small modular reactors</w:t>
+        <w:t>3.1.3 Barriers to Emissions Reduction</w:t>
       </w:r>
     </w:p>
     <w:p>
@@ -3556,7 +3974,7 @@
       </w:pPr>
       <w:r>
         <w:rPr/>
-        <w:t>3.1.4 The initiative: low-clinker concrete for the Darlington Units 2–4 infill</w:t>
+        <w:t>3.1.4 The Proposed Initiative</w:t>
       </w:r>
     </w:p>
     <w:p>
@@ -4135,7 +4553,7 @@
       </w:pPr>
       <w:r>
         <w:rPr/>
-        <w:t>3.1.5 Materials from extraction to end-of-life</w:t>
+        <w:t>3.1.5 Materials from Extraction to End-of-Life</w:t>
       </w:r>
     </w:p>
     <w:p>
@@ -4930,7 +5348,7 @@
       </w:pPr>
       <w:r>
         <w:rPr/>
-        <w:t>3.2.1 Goal, scope and method</w:t>
+        <w:t>3.2.1 Goal, Scope and Method</w:t>
       </w:r>
     </w:p>
     <w:p>
@@ -5026,7 +5444,7 @@
       </w:pPr>
       <w:r>
         <w:rPr/>
-        <w:t>3.2.2 Baseline and hotspots</w:t>
+        <w:t>3.2.2 Baseline and Hotspots</w:t>
       </w:r>
     </w:p>
     <w:p>
@@ -5133,7 +5551,7 @@
       </w:pPr>
       <w:r>
         <w:rPr/>
-        <w:t>3.2.3 The initiative against the baseline</w:t>
+        <w:t>3.2.3 The Initiative against the Baseline</w:t>
       </w:r>
     </w:p>
     <w:p>
@@ -6059,7 +6477,7 @@
       </w:pPr>
       <w:r>
         <w:rPr/>
-        <w:t>3.2.4 Uncertainty: tornado and Monte Carlo</w:t>
+        <w:t>3.2.4 Uncertainty Analysis</w:t>
       </w:r>
     </w:p>
     <w:p>
@@ -6211,7 +6629,7 @@
       </w:pPr>
       <w:r>
         <w:rPr/>
-        <w:t>3.2.5 Comparison with published values</w:t>
+        <w:t>3.2.5 Comparison with Published Values</w:t>
       </w:r>
     </w:p>
     <w:p>
@@ -6307,7 +6725,7 @@
       </w:pPr>
       <w:r>
         <w:rPr/>
-        <w:t>3.3 National Strategies and Industrial Policies: Carbon Avoided in Ontario and Australia</w:t>
+        <w:t>3.3 National Strategies and Industrial Policies</w:t>
       </w:r>
     </w:p>
     <w:p>
@@ -6327,7 +6745,7 @@
       </w:pPr>
       <w:r>
         <w:rPr/>
-        <w:t>3.3.1 The value of schedule</w:t>
+        <w:t>3.3.1 The Value of Schedule</w:t>
       </w:r>
     </w:p>
     <w:p>
@@ -6818,7 +7236,7 @@
       </w:pPr>
       <w:r>
         <w:rPr/>
-        <w:t>3.3.2 What one BWRX-300 displaces: Darlington vs Liddell</w:t>
+        <w:t>3.3.2 Carbon Displaced: Darlington vs Liddell</w:t>
       </w:r>
     </w:p>
     <w:p>
@@ -6914,7 +7332,7 @@
       </w:pPr>
       <w:r>
         <w:rPr/>
-        <w:t>3.3.3 The same money on firmed renewables</w:t>
+        <w:t>3.3.3 Firmed Renewables for the Same Money</w:t>
       </w:r>
     </w:p>
     <w:p>
@@ -7020,7 +7438,7 @@
       </w:pPr>
       <w:r>
         <w:rPr/>
-        <w:t>3.4.1 Stakeholders and money flows</w:t>
+        <w:t>3.4.1 Stakeholders and Money Flows</w:t>
       </w:r>
     </w:p>
     <w:p>
@@ -8101,7 +8519,7 @@
       </w:pPr>
       <w:r>
         <w:rPr/>
-        <w:t>3.4.2 Social licence</w:t>
+        <w:t>3.4.2 Social Licence</w:t>
       </w:r>
     </w:p>
     <w:p>
@@ -8895,7 +9313,7 @@
       </w:pPr>
       <w:r>
         <w:rPr/>
-        <w:t>3.5.1 Economics, finance and market barriers</w:t>
+        <w:t>3.5.1 Economics, Finance and Market Barriers</w:t>
       </w:r>
     </w:p>
     <w:p>
@@ -10124,7 +10542,7 @@
       </w:pPr>
       <w:r>
         <w:rPr/>
-        <w:t>3.5.2 Supply concentration and geopolitics</w:t>
+        <w:t>3.5.2 Supply Concentration and Geopolitics</w:t>
       </w:r>
     </w:p>
     <w:p>
@@ -11312,7 +11730,7 @@
       </w:pPr>
       <w:r>
         <w:rPr/>
-        <w:t>3.6.1 Law, regulation and licensing</w:t>
+        <w:t>3.6.1 Law, Regulation and Licensing</w:t>
       </w:r>
     </w:p>
     <w:p>
@@ -12123,7 +12541,7 @@
       </w:pPr>
       <w:r>
         <w:rPr/>
-        <w:t>3.6.2 Implementation pathway</w:t>
+        <w:t>3.6.2 Implementation Pathway</w:t>
       </w:r>
     </w:p>
     <w:p>
@@ -13242,7 +13660,7 @@
       </w:pPr>
       <w:r>
         <w:rPr/>
-        <w:t>3.7 Triple-bottom-line evaluation and multi-criteria analysis</w:t>
+        <w:t>3.7 Triple Bottom Line and Multi-Criteria Analysis</w:t>
       </w:r>
     </w:p>
     <w:p>
@@ -13262,7 +13680,7 @@
       </w:pPr>
       <w:r>
         <w:rPr/>
-        <w:t>3.7.1 Triple bottom line</w:t>
+        <w:t>3.7.1 Triple Bottom Line</w:t>
       </w:r>
     </w:p>
     <w:p>
@@ -14166,7 +14584,7 @@
       </w:pPr>
       <w:r>
         <w:rPr/>
-        <w:t>3.7.2 Multi-criteria analysis</w:t>
+        <w:t>3.7.2 Multi-Criteria Analysis</w:t>
       </w:r>
     </w:p>
     <w:p>
@@ -15274,7 +15692,7 @@
       </w:pPr>
       <w:r>
         <w:rPr/>
-        <w:t>3.7.3 Verdict and limits</w:t>
+        <w:t>3.7.3 Verdict and Limits</w:t>
       </w:r>
     </w:p>
     <w:p>
@@ -15314,7 +15732,7 @@
       </w:pPr>
       <w:r>
         <w:rPr/>
-        <w:t>3.8 Future material properties and processes</w:t>
+        <w:t>3.8 Future Material Properties and Processes</w:t>
       </w:r>
     </w:p>
     <w:p>
@@ -18361,17 +18779,20 @@
     </w:p>
     <w:p>
       <w:pPr>
-        <w:pStyle w:val="Heading4"/>
-        <w:rPr/>
-      </w:pPr>
-      <w:r>
-        <w:rPr/>
+        <w:pStyle w:val="BodyText"/>
+        <w:rPr/>
+      </w:pPr>
+      <w:r>
+        <w:rPr>
+          <w:b/>
+          <w:bCs/>
+        </w:rPr>
         <w:t>Legislation</w:t>
       </w:r>
     </w:p>
     <w:p>
       <w:pPr>
-        <w:pStyle w:val="FirstParagraph"/>
+        <w:pStyle w:val="BodyText"/>
         <w:rPr/>
       </w:pPr>
       <w:r>
@@ -18422,17 +18843,20 @@
     </w:p>
     <w:p>
       <w:pPr>
-        <w:pStyle w:val="Heading4"/>
-        <w:rPr/>
-      </w:pPr>
-      <w:r>
-        <w:rPr/>
+        <w:pStyle w:val="BodyText"/>
+        <w:rPr/>
+      </w:pPr>
+      <w:r>
+        <w:rPr>
+          <w:b/>
+          <w:bCs/>
+        </w:rPr>
         <w:t>Cases</w:t>
       </w:r>
     </w:p>
     <w:p>
       <w:pPr>
-        <w:pStyle w:val="FirstParagraph"/>
+        <w:pStyle w:val="BodyText"/>
         <w:rPr/>
       </w:pPr>
       <w:r>
@@ -30294,7 +30718,7 @@
         <w:tab w:val="clear" w:pos="720"/>
         <w:tab w:val="right" w:pos="9026" w:leader="dot"/>
       </w:tabs>
-      <w:spacing w:lineRule="auto" w:line="240" w:before="60" w:after="60"/>
+      <w:spacing w:lineRule="auto" w:line="240" w:before="0" w:after="20"/>
       <w:ind w:left="0"/>
     </w:pPr>
     <w:rPr>
@@ -30316,7 +30740,7 @@
         <w:tab w:val="clear" w:pos="720"/>
         <w:tab w:val="right" w:pos="9026" w:leader="dot"/>
       </w:tabs>
-      <w:spacing w:lineRule="auto" w:line="240" w:before="60" w:after="60"/>
+      <w:spacing w:lineRule="auto" w:line="240" w:before="0" w:after="20"/>
       <w:ind w:left="720"/>
     </w:pPr>
     <w:rPr>
@@ -30336,7 +30760,7 @@
         <w:tab w:val="clear" w:pos="720"/>
         <w:tab w:val="right" w:pos="9026" w:leader="dot"/>
       </w:tabs>
-      <w:spacing w:lineRule="auto" w:line="240" w:before="60" w:after="60"/>
+      <w:spacing w:lineRule="auto" w:line="240" w:before="0" w:after="20"/>
       <w:ind w:left="1440"/>
     </w:pPr>
     <w:rPr>

</xml_diff>

<commit_message>
Add Sam's Granta EduPack Eco Audit: reports, figures F9-F10, Section 3.2 cross-check, Appendix A9 table; flag the LC3 record factor
Co-Authored-By: Claude Opus 5.5 <noreply@anthropic.com>
Claude-Session: https://claude.ai/code/session_01SZLM437PwZArBFHgvvPCk4
</commit_message>
<xml_diff>
--- a/01_Report/MTE4593 Group 9 SMR Report - TEAM REVIEW.docx
+++ b/01_Report/MTE4593 Group 9 SMR Report - TEAM REVIEW.docx
@@ -117,11 +117,7 @@
           <w:b/>
           <w:bCs/>
         </w:rPr>
-        <w:t>Leroy: Granta EduPack</w:t>
-      </w:r>
-      <w:r>
-        <w:rPr/>
-        <w:t xml:space="preserve"> (the only open technical item)</w:t>
+        <w:t>Sam / Leroy: Granta LC³ record</w:t>
       </w:r>
     </w:p>
     <w:p>
@@ -135,21 +131,7 @@
       </w:pPr>
       <w:r>
         <w:rPr/>
-        <w:t>Run the Granta EduPack Eco Audit as set out in the note at the top of Section 3.2, and send the results (screenshots or export).</w:t>
-      </w:r>
-    </w:p>
-    <w:p>
-      <w:pPr>
-        <w:pStyle w:val="Compact"/>
-        <w:numPr>
-          <w:ilvl w:val="0"/>
-          <w:numId w:val="1"/>
-        </w:numPr>
-        <w:rPr/>
-      </w:pPr>
-      <w:r>
-        <w:rPr/>
-        <w:t>The results go in Section 3.2, Appendix A9 and one sentence in Section 2. The report currently says Granta was planned but not completed.</w:t>
+        <w:t>The Granta LC³ material record uses 0.1533 kg CO₂e/kg, only 3% below the base concrete (0.1583). Pillai et al. (2019) gives 270 kg/m³ = 0.1125 kg/kg. Confirm whether 0.1533 is intended; Appendix A9 explains both.</w:t>
       </w:r>
     </w:p>
     <w:p>
@@ -1126,7 +1108,7 @@
             </w:rPr>
             <w:t>Appendix B. Policy, economics and supply calculations</w:t>
             <w:tab/>
-            <w:t>45</w:t>
+            <w:t>47</w:t>
           </w:r>
         </w:p>
         <w:p>
@@ -1145,7 +1127,7 @@
             </w:rPr>
             <w:t>Appendix C. Sensitivity analysis</w:t>
             <w:tab/>
-            <w:t>48</w:t>
+            <w:t>50</w:t>
           </w:r>
         </w:p>
         <w:p>
@@ -1164,7 +1146,7 @@
             </w:rPr>
             <w:t>Appendix E. Search log</w:t>
             <w:tab/>
-            <w:t>50</w:t>
+            <w:t>51</w:t>
           </w:r>
           <w:r>
             <w:rPr>
@@ -1342,10 +1324,8 @@
         <w:rPr/>
       </w:pPr>
       <w:r>
-        <w:rPr>
-          <w:rStyle w:val="TeamNote"/>
-        </w:rPr>
-        <w:t>LEROY: once Granta is run, this section’s Granta sentence changes to describe it.</w:t>
+        <w:rPr/>
+        <w:t>Four methods carry the numbers: a screening life-cycle assessment (LCA), grid displacement with a schedule break-even, a concentration index for fuel supply, and a multi-criteria analysis. Scripts and parameter files regenerate every figure (Appendix A1). Values come from the documents cited; our assumptions and inferences are labelled.</w:t>
       </w:r>
     </w:p>
     <w:p>
@@ -1355,17 +1335,7 @@
       </w:pPr>
       <w:r>
         <w:rPr/>
-        <w:t>Four methods carry the numbers: a screening life-cycle assessment (LCA), grid displacement with a schedule break-even, a concentration index for fuel supply, and a multi-criteria analysis. Scripts and parameter files regenerate every figure (Appendix A1). Values come from the documents cited; our assumptions and inferences are labelled.</w:t>
-      </w:r>
-    </w:p>
-    <w:p>
-      <w:pPr>
-        <w:pStyle w:val="BodyText"/>
-        <w:rPr/>
-      </w:pPr>
-      <w:r>
-        <w:rPr/>
-        <w:t>A screening study following ISO 14040/14044 principles (International Organization for Standardization, 2006a; 2006b), not critically reviewed: functional unit 1 MWh of net electricity at the grid connection, cradle to grave (Section 3.2.1). A Granta EduPack cross-check was planned but not completed.</w:t>
+        <w:t>A screening study following ISO 14040/14044 principles (International Organization for Standardization, 2006a; 2006b), not critically reviewed: functional unit 1 MWh of net electricity at the grid connection, cradle to grave (Section 3.2.1). The construction materials were cross-checked with a Granta EduPack 2024 Eco Audit of one unit (Appendix A9).</w:t>
       </w:r>
     </w:p>
     <w:p>
@@ -5325,10 +5295,28 @@
         <w:rPr/>
       </w:pPr>
       <w:r>
-        <w:rPr>
-          <w:rStyle w:val="TeamNote"/>
-        </w:rPr>
-        <w:t>LEROY (Granta EduPack): please run the Granta EduPack Eco Audit on one BWRX-300: concrete 120,000 t (50,000 m³ × 2.4 t/m³) and steel 14,000 t (Ostrołęka PIS, Table 14), with a second run where 40% of the concrete (20,000 m³) is LC³ at 270 instead of 380 kg CO₂e/m³ (Pillai et al., 2019). Send the CO₂ footprint and energy per life stage (screenshot or export). Then confirm or update this section’s Granta sentence, Appendix A9 and Section 2. Everything else in the report is complete.</w:t>
+        <w:rPr/>
+        <w:t>One BWRX-300 at Darlington emits an estimated 4.4 g CO₂e per kWh (Monte Carlo median; 90% interval 3.2–6.1; 3.5 if conversion heat takes its central published value), below UNECE’s 5.1–6.4 g/kWh for nuclear power. The fuel front end contributes 62% and construction 11.5%. The initiative, C1 (Section 3.1.4), puts limestone calcined clay cement (LC³) in 20–60% of the concrete. It saves 2,200 t CO₂e per unit (1,100–3,300 t), about 0.36% of the life cycle: real but small, so worth adopting only if schedule-neutral (Section 3.2.3).</w:t>
+      </w:r>
+    </w:p>
+    <w:p>
+      <w:pPr>
+        <w:pStyle w:val="Heading3"/>
+        <w:rPr/>
+      </w:pPr>
+      <w:r>
+        <w:rPr/>
+        <w:t>3.2.1 Goal, Scope and Method</w:t>
+      </w:r>
+    </w:p>
+    <w:p>
+      <w:pPr>
+        <w:pStyle w:val="FirstParagraph"/>
+        <w:rPr/>
+      </w:pPr>
+      <w:r>
+        <w:rPr/>
+        <w:t>This is a screening LCA of one BWRX-300 at Darlington following ISO 14040/14044 principles (International Organization for Standardization, 2006a; 2006b), not critically reviewed.</w:t>
       </w:r>
     </w:p>
     <w:p>
@@ -5338,27 +5326,7 @@
       </w:pPr>
       <w:r>
         <w:rPr/>
-        <w:t>One BWRX-300 at Darlington emits an estimated 4.4 g CO₂e per kWh (Monte Carlo median; 90% interval 3.2–6.1; 3.5 if conversion heat takes its central published value), below UNECE’s 5.1–6.4 g/kWh for nuclear power. The fuel front end contributes 62% and construction 11.5%. The initiative, C1 (Section 3.1.4), puts limestone calcined clay cement (LC³) in 20–60% of the concrete. It saves 2,200 t CO₂e per unit (1,100–3,300 t), about 0.36% of the life cycle: real but small, so worth adopting only if schedule-neutral (Section 3.2.3).</w:t>
-      </w:r>
-    </w:p>
-    <w:p>
-      <w:pPr>
-        <w:pStyle w:val="Heading3"/>
-        <w:rPr/>
-      </w:pPr>
-      <w:r>
-        <w:rPr/>
-        <w:t>3.2.1 Goal, Scope and Method</w:t>
-      </w:r>
-    </w:p>
-    <w:p>
-      <w:pPr>
-        <w:pStyle w:val="FirstParagraph"/>
-        <w:rPr/>
-      </w:pPr>
-      <w:r>
-        <w:rPr/>
-        <w:t>This is a screening LCA of one BWRX-300 at Darlington following ISO 14040/14044 principles (International Organization for Standardization, 2006a; 2006b), not critically reviewed.</w:t>
+        <w:t>Functional unit: 1 MWh of net electricity at the grid connection. One unit delivers 300 MWe × 8,760 h × 0.90 × 60 years = 1.419 × 10⁸ MWh (Appendix A2). Boundary (Figure F1): cradle to grave. Construction materials and the fuel front end are modelled from published factors; operation and maintenance (O&amp;M), decommissioning and the back end are per-kWh values from EDF’s French-fleet study (EDF R&amp;D, 2024). Baseline (S0): the concrete OPG would pour anyway, at 380 kg CO₂e/m³ (Pillai et al., 2019, as reported). We have not seen OPG’s mix or any cement-type limit (GE-Hitachi Nuclear Energy, 2024). Cut-offs: fuel cladding, conversion chemicals, upstream gas, fuel-plant capital goods and recycling credits; each biases the result low (Section 3.2.5). Impact category: GWP100.</w:t>
       </w:r>
     </w:p>
     <w:p>
@@ -5368,17 +5336,7 @@
       </w:pPr>
       <w:r>
         <w:rPr/>
-        <w:t>Functional unit: 1 MWh of net electricity at the grid connection. One unit delivers 300 MWe × 8,760 h × 0.90 × 60 years = 1.419 × 10⁸ MWh (Appendix A2). Boundary (Figure F1): cradle to grave. Construction materials and the fuel front end are modelled from published factors; operation and maintenance (O&amp;M), decommissioning and the back end are per-kWh values from EDF’s French-fleet study (EDF R&amp;D, 2024). Baseline (S0): the concrete OPG would pour anyway, at 380 kg CO₂e/m³ (Pillai et al., 2019, as reported). We have not seen OPG’s mix or any cement-type limit (GE-Hitachi Nuclear Energy, 2024). Cut-offs: fuel cladding, conversion chemicals, upstream gas, fuel-plant capital goods and recycling credits; each biases the result low (Section 3.2.5). Impact category: GWP100.</w:t>
-      </w:r>
-    </w:p>
-    <w:p>
-      <w:pPr>
-        <w:pStyle w:val="BodyText"/>
-        <w:rPr/>
-      </w:pPr>
-      <w:r>
-        <w:rPr/>
-        <w:t>A reproducible Python model multiplies quantities by published emission factors (Appendices A and C). Plant quantities come from the Ostrołęka project information sheet (BWRX-300 Ostrołęka sp. z o.o., 2023, as reported): 50,000 m³ of concrete and 14,000 t of steel per unit, a design proxy, not confirmed Darlington quantities. A bottom-up scaling (20,700 m³; Peterson, Zhao and Petroski, 2005) is a cross-check (Appendix A3). A Granta EduPack Eco Audit was planned but not completed; no number here comes from Granta.</w:t>
+        <w:t>A reproducible Python model multiplies quantities by published emission factors (Appendices A and C). Plant quantities come from the Ostrołęka project information sheet (BWRX-300 Ostrołęka sp. z o.o., 2023, as reported): 50,000 m³ of concrete and 14,000 t of steel per unit, a design proxy, not confirmed Darlington quantities. A bottom-up scaling (20,700 m³; Peterson, Zhao and Petroski, 2005) is a cross-check (Appendix A3). Granta EduPack cross-check. A Granta EduPack 2024 Eco Audit of one unit’s construction materials (120,000 t of concrete and 14,000 t of steel, with transport and steel recycling at end of life) gives 58,900 t CO₂e and 660 TJ for the first life, within about 2% of our scripted construction total of 57,600 t (Appendix A9, Figure F9). With the team’s LC³ material record (0.153 kg CO₂e/kg, against 0.158 for the base concrete), Granta’s saving is only about 240 t (−0.5%), because that record does not carry Pillai et al.’s (2019) 29% reduction; at Pillai’s 270 kg CO₂e/m³ (0.1125 kg/kg) the same model gives 2,200 t, matching our result. Granta also shows LC³’s embodied energy 33% lower per kilogram (0.60 against 0.90 MJ/kg), about 14 TJ less per unit.</w:t>
       </w:r>
     </w:p>
     <w:p>
@@ -22157,7 +22115,1384 @@
       </w:pPr>
       <w:r>
         <w:rPr/>
-        <w:t>A Granta EduPack Eco Audit cross-check was planned but not completed; the screening model above is the basis of all results.</w:t>
+        <w:t xml:space="preserve">Granta EduPack 2024 R1 Eco Audit, one BWRX-300, product life 30 years, country of use North America (team model; full reports in the repository, </w:t>
+      </w:r>
+      <w:r>
+        <w:rPr>
+          <w:rStyle w:val="VerbatimChar"/>
+        </w:rPr>
+        <w:t>03_LCA_Calculations/granta/</w:t>
+      </w:r>
+      <w:r>
+        <w:rPr/>
+        <w:t>). Components: base concrete 120,000 t (user-defined record, 0.1583 kg CO₂e/kg, 0.90 MJ/kg); structural steel 6,000 t and modular steel 8,000 t (low-carbon steel, virgin, roll formed); transport by truck, 30 km for concrete and 200 km for steel; steel recycled at end of life, concrete not. In the LC³ case 48,000 t (40%) of the concrete uses the team’s LC³ record (0.1533 kg CO₂e/kg, 0.603 MJ/kg).</w:t>
+      </w:r>
+    </w:p>
+    <w:p>
+      <w:pPr>
+        <w:pStyle w:val="BodyText"/>
+        <w:rPr/>
+      </w:pPr>
+      <w:r>
+        <w:rPr>
+          <w:i/>
+          <w:iCs/>
+        </w:rPr>
+        <w:t>Table A9. Granta Eco Audit results for one unit (first life).</w:t>
+      </w:r>
+      <w:r>
+        <w:rPr/>
+        <w:t xml:space="preserve"> </w:t>
+      </w:r>
+      <w:r>
+        <w:rPr>
+          <w:i/>
+          <w:iCs/>
+        </w:rPr>
+        <w:t>Source: Granta EduPack 2024 R1 Eco Audit reports, Base Reactor and LC3 Reactor (25 October 2026).</w:t>
+      </w:r>
+    </w:p>
+    <w:tbl>
+      <w:tblPr>
+        <w:tblStyle w:val="Table"/>
+        <w:tblW w:w="7920" w:type="dxa"/>
+        <w:jc w:val="left"/>
+        <w:tblInd w:w="0" w:type="dxa"/>
+        <w:tblBorders>
+          <w:top w:val="single" w:sz="8" w:space="0" w:color="000000"/>
+          <w:left w:val="single" w:sz="8" w:space="0" w:color="000000"/>
+          <w:bottom w:val="single" w:sz="8" w:space="0" w:color="000000"/>
+          <w:right w:val="single" w:sz="8" w:space="0" w:color="000000"/>
+          <w:insideH w:val="single" w:sz="8" w:space="0" w:color="000000"/>
+          <w:insideV w:val="single" w:sz="8" w:space="0" w:color="000000"/>
+        </w:tblBorders>
+        <w:tblLayout w:type="fixed"/>
+        <w:tblCellMar>
+          <w:top w:w="30" w:type="dxa"/>
+          <w:left w:w="80" w:type="dxa"/>
+          <w:bottom w:w="30" w:type="dxa"/>
+          <w:right w:w="80" w:type="dxa"/>
+        </w:tblCellMar>
+        <w:tblLook w:val="0020" w:noHBand="0" w:noVBand="0" w:firstColumn="0" w:lastRow="0" w:lastColumn="0" w:firstRow="1"/>
+      </w:tblPr>
+      <w:tblGrid>
+        <w:gridCol w:w="1584"/>
+        <w:gridCol w:w="1584"/>
+        <w:gridCol w:w="1584"/>
+        <w:gridCol w:w="1584"/>
+        <w:gridCol w:w="1584"/>
+      </w:tblGrid>
+      <w:tr>
+        <w:trPr>
+          <w:tblHeader w:val="true"/>
+        </w:trPr>
+        <w:tc>
+          <w:tcPr>
+            <w:tcW w:w="1584" w:type="dxa"/>
+            <w:tcBorders>
+              <w:top w:val="single" w:sz="8" w:space="0" w:color="000000"/>
+              <w:left w:val="single" w:sz="8" w:space="0" w:color="000000"/>
+              <w:bottom w:val="single" w:sz="8" w:space="0" w:color="000000"/>
+              <w:right w:val="single" w:sz="8" w:space="0" w:color="000000"/>
+            </w:tcBorders>
+            <w:shd w:color="auto" w:fill="EDEDED" w:val="clear"/>
+          </w:tcPr>
+          <w:p>
+            <w:pPr>
+              <w:pStyle w:val="Compact"/>
+              <w:widowControl/>
+              <w:spacing w:lineRule="auto" w:line="276" w:before="36" w:after="36"/>
+              <w:jc w:val="left"/>
+              <w:rPr>
+                <w:rFonts w:ascii="Aptos" w:hAnsi="Aptos" w:eastAsia="Aptos" w:cs="Aptos"/>
+                <w:b/>
+                <w:kern w:val="0"/>
+                <w:lang w:val="en-US"/>
+              </w:rPr>
+            </w:pPr>
+            <w:r>
+              <w:rPr>
+                <w:rFonts w:eastAsia="Aptos" w:cs="Aptos"/>
+                <w:b/>
+                <w:kern w:val="0"/>
+                <w:lang w:val="en-US"/>
+              </w:rPr>
+              <w:t>Phase</w:t>
+            </w:r>
+          </w:p>
+        </w:tc>
+        <w:tc>
+          <w:tcPr>
+            <w:tcW w:w="1584" w:type="dxa"/>
+            <w:tcBorders>
+              <w:top w:val="single" w:sz="8" w:space="0" w:color="000000"/>
+              <w:left w:val="single" w:sz="8" w:space="0" w:color="000000"/>
+              <w:bottom w:val="single" w:sz="8" w:space="0" w:color="000000"/>
+              <w:right w:val="single" w:sz="8" w:space="0" w:color="000000"/>
+            </w:tcBorders>
+            <w:shd w:color="auto" w:fill="EDEDED" w:val="clear"/>
+          </w:tcPr>
+          <w:p>
+            <w:pPr>
+              <w:pStyle w:val="Compact"/>
+              <w:widowControl/>
+              <w:spacing w:lineRule="auto" w:line="276" w:before="36" w:after="36"/>
+              <w:jc w:val="right"/>
+              <w:rPr>
+                <w:rFonts w:ascii="Aptos" w:hAnsi="Aptos" w:eastAsia="Aptos" w:cs="Aptos"/>
+                <w:b/>
+                <w:kern w:val="0"/>
+                <w:lang w:val="en-US"/>
+              </w:rPr>
+            </w:pPr>
+            <w:r>
+              <w:rPr>
+                <w:rFonts w:eastAsia="Aptos" w:cs="Aptos"/>
+                <w:b/>
+                <w:kern w:val="0"/>
+                <w:lang w:val="en-US"/>
+              </w:rPr>
+              <w:t>Base: CO₂e (t)</w:t>
+            </w:r>
+          </w:p>
+        </w:tc>
+        <w:tc>
+          <w:tcPr>
+            <w:tcW w:w="1584" w:type="dxa"/>
+            <w:tcBorders>
+              <w:top w:val="single" w:sz="8" w:space="0" w:color="000000"/>
+              <w:left w:val="single" w:sz="8" w:space="0" w:color="000000"/>
+              <w:bottom w:val="single" w:sz="8" w:space="0" w:color="000000"/>
+              <w:right w:val="single" w:sz="8" w:space="0" w:color="000000"/>
+            </w:tcBorders>
+            <w:shd w:color="auto" w:fill="EDEDED" w:val="clear"/>
+          </w:tcPr>
+          <w:p>
+            <w:pPr>
+              <w:pStyle w:val="Compact"/>
+              <w:widowControl/>
+              <w:spacing w:lineRule="auto" w:line="276" w:before="36" w:after="36"/>
+              <w:jc w:val="right"/>
+              <w:rPr>
+                <w:rFonts w:ascii="Aptos" w:hAnsi="Aptos" w:eastAsia="Aptos" w:cs="Aptos"/>
+                <w:b/>
+                <w:kern w:val="0"/>
+                <w:lang w:val="en-US"/>
+              </w:rPr>
+            </w:pPr>
+            <w:r>
+              <w:rPr>
+                <w:rFonts w:eastAsia="Aptos" w:cs="Aptos"/>
+                <w:b/>
+                <w:kern w:val="0"/>
+                <w:lang w:val="en-US"/>
+              </w:rPr>
+              <w:t>LC³: CO₂e (t)</w:t>
+            </w:r>
+          </w:p>
+        </w:tc>
+        <w:tc>
+          <w:tcPr>
+            <w:tcW w:w="1584" w:type="dxa"/>
+            <w:tcBorders>
+              <w:top w:val="single" w:sz="8" w:space="0" w:color="000000"/>
+              <w:left w:val="single" w:sz="8" w:space="0" w:color="000000"/>
+              <w:bottom w:val="single" w:sz="8" w:space="0" w:color="000000"/>
+              <w:right w:val="single" w:sz="8" w:space="0" w:color="000000"/>
+            </w:tcBorders>
+            <w:shd w:color="auto" w:fill="EDEDED" w:val="clear"/>
+          </w:tcPr>
+          <w:p>
+            <w:pPr>
+              <w:pStyle w:val="Compact"/>
+              <w:widowControl/>
+              <w:spacing w:lineRule="auto" w:line="276" w:before="36" w:after="36"/>
+              <w:jc w:val="right"/>
+              <w:rPr>
+                <w:rFonts w:ascii="Aptos" w:hAnsi="Aptos" w:eastAsia="Aptos" w:cs="Aptos"/>
+                <w:b/>
+                <w:kern w:val="0"/>
+                <w:lang w:val="en-US"/>
+              </w:rPr>
+            </w:pPr>
+            <w:r>
+              <w:rPr>
+                <w:rFonts w:eastAsia="Aptos" w:cs="Aptos"/>
+                <w:b/>
+                <w:kern w:val="0"/>
+                <w:lang w:val="en-US"/>
+              </w:rPr>
+              <w:t>Base: energy (TJ)</w:t>
+            </w:r>
+          </w:p>
+        </w:tc>
+        <w:tc>
+          <w:tcPr>
+            <w:tcW w:w="1584" w:type="dxa"/>
+            <w:tcBorders>
+              <w:top w:val="single" w:sz="8" w:space="0" w:color="000000"/>
+              <w:left w:val="single" w:sz="8" w:space="0" w:color="000000"/>
+              <w:bottom w:val="single" w:sz="8" w:space="0" w:color="000000"/>
+              <w:right w:val="single" w:sz="8" w:space="0" w:color="000000"/>
+            </w:tcBorders>
+            <w:shd w:color="auto" w:fill="EDEDED" w:val="clear"/>
+          </w:tcPr>
+          <w:p>
+            <w:pPr>
+              <w:pStyle w:val="Compact"/>
+              <w:widowControl/>
+              <w:spacing w:lineRule="auto" w:line="276" w:before="36" w:after="36"/>
+              <w:jc w:val="right"/>
+              <w:rPr>
+                <w:rFonts w:ascii="Aptos" w:hAnsi="Aptos" w:eastAsia="Aptos" w:cs="Aptos"/>
+                <w:b/>
+                <w:kern w:val="0"/>
+                <w:lang w:val="en-US"/>
+              </w:rPr>
+            </w:pPr>
+            <w:r>
+              <w:rPr>
+                <w:rFonts w:eastAsia="Aptos" w:cs="Aptos"/>
+                <w:b/>
+                <w:kern w:val="0"/>
+                <w:lang w:val="en-US"/>
+              </w:rPr>
+              <w:t>LC³: energy (TJ)</w:t>
+            </w:r>
+          </w:p>
+        </w:tc>
+      </w:tr>
+      <w:tr>
+        <w:trPr/>
+        <w:tc>
+          <w:tcPr>
+            <w:tcW w:w="1584" w:type="dxa"/>
+            <w:tcBorders>
+              <w:top w:val="single" w:sz="8" w:space="0" w:color="000000"/>
+              <w:left w:val="single" w:sz="8" w:space="0" w:color="000000"/>
+              <w:bottom w:val="single" w:sz="8" w:space="0" w:color="000000"/>
+              <w:right w:val="single" w:sz="8" w:space="0" w:color="000000"/>
+            </w:tcBorders>
+          </w:tcPr>
+          <w:p>
+            <w:pPr>
+              <w:pStyle w:val="Compact"/>
+              <w:widowControl/>
+              <w:spacing w:lineRule="auto" w:line="276" w:before="36" w:after="36"/>
+              <w:jc w:val="left"/>
+              <w:rPr>
+                <w:rFonts w:ascii="Aptos" w:hAnsi="Aptos" w:eastAsia="Aptos" w:cs="Aptos"/>
+                <w:kern w:val="0"/>
+                <w:lang w:val="en-US"/>
+              </w:rPr>
+            </w:pPr>
+            <w:r>
+              <w:rPr>
+                <w:rFonts w:eastAsia="Aptos" w:cs="Aptos"/>
+                <w:kern w:val="0"/>
+                <w:lang w:val="en-US"/>
+              </w:rPr>
+              <w:t>Material</w:t>
+            </w:r>
+          </w:p>
+        </w:tc>
+        <w:tc>
+          <w:tcPr>
+            <w:tcW w:w="1584" w:type="dxa"/>
+            <w:tcBorders>
+              <w:top w:val="single" w:sz="8" w:space="0" w:color="000000"/>
+              <w:left w:val="single" w:sz="8" w:space="0" w:color="000000"/>
+              <w:bottom w:val="single" w:sz="8" w:space="0" w:color="000000"/>
+              <w:right w:val="single" w:sz="8" w:space="0" w:color="000000"/>
+            </w:tcBorders>
+          </w:tcPr>
+          <w:p>
+            <w:pPr>
+              <w:pStyle w:val="Compact"/>
+              <w:widowControl/>
+              <w:spacing w:lineRule="auto" w:line="276" w:before="36" w:after="36"/>
+              <w:jc w:val="right"/>
+              <w:rPr>
+                <w:rFonts w:ascii="Aptos" w:hAnsi="Aptos" w:eastAsia="Aptos" w:cs="Aptos"/>
+                <w:kern w:val="0"/>
+                <w:lang w:val="en-US"/>
+              </w:rPr>
+            </w:pPr>
+            <w:r>
+              <w:rPr>
+                <w:rFonts w:eastAsia="Aptos" w:cs="Aptos"/>
+                <w:kern w:val="0"/>
+                <w:lang w:val="en-US"/>
+              </w:rPr>
+              <w:t>51,600</w:t>
+            </w:r>
+          </w:p>
+        </w:tc>
+        <w:tc>
+          <w:tcPr>
+            <w:tcW w:w="1584" w:type="dxa"/>
+            <w:tcBorders>
+              <w:top w:val="single" w:sz="8" w:space="0" w:color="000000"/>
+              <w:left w:val="single" w:sz="8" w:space="0" w:color="000000"/>
+              <w:bottom w:val="single" w:sz="8" w:space="0" w:color="000000"/>
+              <w:right w:val="single" w:sz="8" w:space="0" w:color="000000"/>
+            </w:tcBorders>
+          </w:tcPr>
+          <w:p>
+            <w:pPr>
+              <w:pStyle w:val="Compact"/>
+              <w:widowControl/>
+              <w:spacing w:lineRule="auto" w:line="276" w:before="36" w:after="36"/>
+              <w:jc w:val="right"/>
+              <w:rPr>
+                <w:rFonts w:ascii="Aptos" w:hAnsi="Aptos" w:eastAsia="Aptos" w:cs="Aptos"/>
+                <w:kern w:val="0"/>
+                <w:lang w:val="en-US"/>
+              </w:rPr>
+            </w:pPr>
+            <w:r>
+              <w:rPr>
+                <w:rFonts w:eastAsia="Aptos" w:cs="Aptos"/>
+                <w:kern w:val="0"/>
+                <w:lang w:val="en-US"/>
+              </w:rPr>
+              <w:t>51,400</w:t>
+            </w:r>
+          </w:p>
+        </w:tc>
+        <w:tc>
+          <w:tcPr>
+            <w:tcW w:w="1584" w:type="dxa"/>
+            <w:tcBorders>
+              <w:top w:val="single" w:sz="8" w:space="0" w:color="000000"/>
+              <w:left w:val="single" w:sz="8" w:space="0" w:color="000000"/>
+              <w:bottom w:val="single" w:sz="8" w:space="0" w:color="000000"/>
+              <w:right w:val="single" w:sz="8" w:space="0" w:color="000000"/>
+            </w:tcBorders>
+          </w:tcPr>
+          <w:p>
+            <w:pPr>
+              <w:pStyle w:val="Compact"/>
+              <w:widowControl/>
+              <w:spacing w:lineRule="auto" w:line="276" w:before="36" w:after="36"/>
+              <w:jc w:val="right"/>
+              <w:rPr>
+                <w:rFonts w:ascii="Aptos" w:hAnsi="Aptos" w:eastAsia="Aptos" w:cs="Aptos"/>
+                <w:kern w:val="0"/>
+                <w:lang w:val="en-US"/>
+              </w:rPr>
+            </w:pPr>
+            <w:r>
+              <w:rPr>
+                <w:rFonts w:eastAsia="Aptos" w:cs="Aptos"/>
+                <w:kern w:val="0"/>
+                <w:lang w:val="en-US"/>
+              </w:rPr>
+              <w:t>554</w:t>
+            </w:r>
+          </w:p>
+        </w:tc>
+        <w:tc>
+          <w:tcPr>
+            <w:tcW w:w="1584" w:type="dxa"/>
+            <w:tcBorders>
+              <w:top w:val="single" w:sz="8" w:space="0" w:color="000000"/>
+              <w:left w:val="single" w:sz="8" w:space="0" w:color="000000"/>
+              <w:bottom w:val="single" w:sz="8" w:space="0" w:color="000000"/>
+              <w:right w:val="single" w:sz="8" w:space="0" w:color="000000"/>
+            </w:tcBorders>
+          </w:tcPr>
+          <w:p>
+            <w:pPr>
+              <w:pStyle w:val="Compact"/>
+              <w:widowControl/>
+              <w:spacing w:lineRule="auto" w:line="276" w:before="36" w:after="36"/>
+              <w:jc w:val="right"/>
+              <w:rPr>
+                <w:rFonts w:ascii="Aptos" w:hAnsi="Aptos" w:eastAsia="Aptos" w:cs="Aptos"/>
+                <w:kern w:val="0"/>
+                <w:lang w:val="en-US"/>
+              </w:rPr>
+            </w:pPr>
+            <w:r>
+              <w:rPr>
+                <w:rFonts w:eastAsia="Aptos" w:cs="Aptos"/>
+                <w:kern w:val="0"/>
+                <w:lang w:val="en-US"/>
+              </w:rPr>
+              <w:t>540</w:t>
+            </w:r>
+          </w:p>
+        </w:tc>
+      </w:tr>
+      <w:tr>
+        <w:trPr/>
+        <w:tc>
+          <w:tcPr>
+            <w:tcW w:w="1584" w:type="dxa"/>
+            <w:tcBorders>
+              <w:top w:val="single" w:sz="8" w:space="0" w:color="000000"/>
+              <w:left w:val="single" w:sz="8" w:space="0" w:color="000000"/>
+              <w:bottom w:val="single" w:sz="8" w:space="0" w:color="000000"/>
+              <w:right w:val="single" w:sz="8" w:space="0" w:color="000000"/>
+            </w:tcBorders>
+          </w:tcPr>
+          <w:p>
+            <w:pPr>
+              <w:pStyle w:val="Compact"/>
+              <w:widowControl/>
+              <w:spacing w:lineRule="auto" w:line="276" w:before="36" w:after="36"/>
+              <w:jc w:val="left"/>
+              <w:rPr>
+                <w:rFonts w:ascii="Aptos" w:hAnsi="Aptos" w:eastAsia="Aptos" w:cs="Aptos"/>
+                <w:kern w:val="0"/>
+                <w:lang w:val="en-US"/>
+              </w:rPr>
+            </w:pPr>
+            <w:r>
+              <w:rPr>
+                <w:rFonts w:eastAsia="Aptos" w:cs="Aptos"/>
+                <w:kern w:val="0"/>
+                <w:lang w:val="en-US"/>
+              </w:rPr>
+              <w:t>Manufacture</w:t>
+            </w:r>
+          </w:p>
+        </w:tc>
+        <w:tc>
+          <w:tcPr>
+            <w:tcW w:w="1584" w:type="dxa"/>
+            <w:tcBorders>
+              <w:top w:val="single" w:sz="8" w:space="0" w:color="000000"/>
+              <w:left w:val="single" w:sz="8" w:space="0" w:color="000000"/>
+              <w:bottom w:val="single" w:sz="8" w:space="0" w:color="000000"/>
+              <w:right w:val="single" w:sz="8" w:space="0" w:color="000000"/>
+            </w:tcBorders>
+          </w:tcPr>
+          <w:p>
+            <w:pPr>
+              <w:pStyle w:val="Compact"/>
+              <w:widowControl/>
+              <w:spacing w:lineRule="auto" w:line="276" w:before="36" w:after="36"/>
+              <w:jc w:val="right"/>
+              <w:rPr>
+                <w:rFonts w:ascii="Aptos" w:hAnsi="Aptos" w:eastAsia="Aptos" w:cs="Aptos"/>
+                <w:kern w:val="0"/>
+                <w:lang w:val="en-US"/>
+              </w:rPr>
+            </w:pPr>
+            <w:r>
+              <w:rPr>
+                <w:rFonts w:eastAsia="Aptos" w:cs="Aptos"/>
+                <w:kern w:val="0"/>
+                <w:lang w:val="en-US"/>
+              </w:rPr>
+              <w:t>3,030</w:t>
+            </w:r>
+          </w:p>
+        </w:tc>
+        <w:tc>
+          <w:tcPr>
+            <w:tcW w:w="1584" w:type="dxa"/>
+            <w:tcBorders>
+              <w:top w:val="single" w:sz="8" w:space="0" w:color="000000"/>
+              <w:left w:val="single" w:sz="8" w:space="0" w:color="000000"/>
+              <w:bottom w:val="single" w:sz="8" w:space="0" w:color="000000"/>
+              <w:right w:val="single" w:sz="8" w:space="0" w:color="000000"/>
+            </w:tcBorders>
+          </w:tcPr>
+          <w:p>
+            <w:pPr>
+              <w:pStyle w:val="Compact"/>
+              <w:widowControl/>
+              <w:spacing w:lineRule="auto" w:line="276" w:before="36" w:after="36"/>
+              <w:jc w:val="right"/>
+              <w:rPr>
+                <w:rFonts w:ascii="Aptos" w:hAnsi="Aptos" w:eastAsia="Aptos" w:cs="Aptos"/>
+                <w:kern w:val="0"/>
+                <w:lang w:val="en-US"/>
+              </w:rPr>
+            </w:pPr>
+            <w:r>
+              <w:rPr>
+                <w:rFonts w:eastAsia="Aptos" w:cs="Aptos"/>
+                <w:kern w:val="0"/>
+                <w:lang w:val="en-US"/>
+              </w:rPr>
+              <w:t>3,030</w:t>
+            </w:r>
+          </w:p>
+        </w:tc>
+        <w:tc>
+          <w:tcPr>
+            <w:tcW w:w="1584" w:type="dxa"/>
+            <w:tcBorders>
+              <w:top w:val="single" w:sz="8" w:space="0" w:color="000000"/>
+              <w:left w:val="single" w:sz="8" w:space="0" w:color="000000"/>
+              <w:bottom w:val="single" w:sz="8" w:space="0" w:color="000000"/>
+              <w:right w:val="single" w:sz="8" w:space="0" w:color="000000"/>
+            </w:tcBorders>
+          </w:tcPr>
+          <w:p>
+            <w:pPr>
+              <w:pStyle w:val="Compact"/>
+              <w:widowControl/>
+              <w:spacing w:lineRule="auto" w:line="276" w:before="36" w:after="36"/>
+              <w:jc w:val="right"/>
+              <w:rPr>
+                <w:rFonts w:ascii="Aptos" w:hAnsi="Aptos" w:eastAsia="Aptos" w:cs="Aptos"/>
+                <w:kern w:val="0"/>
+                <w:lang w:val="en-US"/>
+              </w:rPr>
+            </w:pPr>
+            <w:r>
+              <w:rPr>
+                <w:rFonts w:eastAsia="Aptos" w:cs="Aptos"/>
+                <w:kern w:val="0"/>
+                <w:lang w:val="en-US"/>
+              </w:rPr>
+              <w:t>40.4</w:t>
+            </w:r>
+          </w:p>
+        </w:tc>
+        <w:tc>
+          <w:tcPr>
+            <w:tcW w:w="1584" w:type="dxa"/>
+            <w:tcBorders>
+              <w:top w:val="single" w:sz="8" w:space="0" w:color="000000"/>
+              <w:left w:val="single" w:sz="8" w:space="0" w:color="000000"/>
+              <w:bottom w:val="single" w:sz="8" w:space="0" w:color="000000"/>
+              <w:right w:val="single" w:sz="8" w:space="0" w:color="000000"/>
+            </w:tcBorders>
+          </w:tcPr>
+          <w:p>
+            <w:pPr>
+              <w:pStyle w:val="Compact"/>
+              <w:widowControl/>
+              <w:spacing w:lineRule="auto" w:line="276" w:before="36" w:after="36"/>
+              <w:jc w:val="right"/>
+              <w:rPr>
+                <w:rFonts w:ascii="Aptos" w:hAnsi="Aptos" w:eastAsia="Aptos" w:cs="Aptos"/>
+                <w:kern w:val="0"/>
+                <w:lang w:val="en-US"/>
+              </w:rPr>
+            </w:pPr>
+            <w:r>
+              <w:rPr>
+                <w:rFonts w:eastAsia="Aptos" w:cs="Aptos"/>
+                <w:kern w:val="0"/>
+                <w:lang w:val="en-US"/>
+              </w:rPr>
+              <w:t>40.4</w:t>
+            </w:r>
+          </w:p>
+        </w:tc>
+      </w:tr>
+      <w:tr>
+        <w:trPr/>
+        <w:tc>
+          <w:tcPr>
+            <w:tcW w:w="1584" w:type="dxa"/>
+            <w:tcBorders>
+              <w:top w:val="single" w:sz="8" w:space="0" w:color="000000"/>
+              <w:left w:val="single" w:sz="8" w:space="0" w:color="000000"/>
+              <w:bottom w:val="single" w:sz="8" w:space="0" w:color="000000"/>
+              <w:right w:val="single" w:sz="8" w:space="0" w:color="000000"/>
+            </w:tcBorders>
+          </w:tcPr>
+          <w:p>
+            <w:pPr>
+              <w:pStyle w:val="Compact"/>
+              <w:widowControl/>
+              <w:spacing w:lineRule="auto" w:line="276" w:before="36" w:after="36"/>
+              <w:jc w:val="left"/>
+              <w:rPr>
+                <w:rFonts w:ascii="Aptos" w:hAnsi="Aptos" w:eastAsia="Aptos" w:cs="Aptos"/>
+                <w:kern w:val="0"/>
+                <w:lang w:val="en-US"/>
+              </w:rPr>
+            </w:pPr>
+            <w:r>
+              <w:rPr>
+                <w:rFonts w:eastAsia="Aptos" w:cs="Aptos"/>
+                <w:kern w:val="0"/>
+                <w:lang w:val="en-US"/>
+              </w:rPr>
+              <w:t>Transport</w:t>
+            </w:r>
+          </w:p>
+        </w:tc>
+        <w:tc>
+          <w:tcPr>
+            <w:tcW w:w="1584" w:type="dxa"/>
+            <w:tcBorders>
+              <w:top w:val="single" w:sz="8" w:space="0" w:color="000000"/>
+              <w:left w:val="single" w:sz="8" w:space="0" w:color="000000"/>
+              <w:bottom w:val="single" w:sz="8" w:space="0" w:color="000000"/>
+              <w:right w:val="single" w:sz="8" w:space="0" w:color="000000"/>
+            </w:tcBorders>
+          </w:tcPr>
+          <w:p>
+            <w:pPr>
+              <w:pStyle w:val="Compact"/>
+              <w:widowControl/>
+              <w:spacing w:lineRule="auto" w:line="276" w:before="36" w:after="36"/>
+              <w:jc w:val="right"/>
+              <w:rPr>
+                <w:rFonts w:ascii="Aptos" w:hAnsi="Aptos" w:eastAsia="Aptos" w:cs="Aptos"/>
+                <w:kern w:val="0"/>
+                <w:lang w:val="en-US"/>
+              </w:rPr>
+            </w:pPr>
+            <w:r>
+              <w:rPr>
+                <w:rFonts w:eastAsia="Aptos" w:cs="Aptos"/>
+                <w:kern w:val="0"/>
+                <w:lang w:val="en-US"/>
+              </w:rPr>
+              <w:t>3,490</w:t>
+            </w:r>
+          </w:p>
+        </w:tc>
+        <w:tc>
+          <w:tcPr>
+            <w:tcW w:w="1584" w:type="dxa"/>
+            <w:tcBorders>
+              <w:top w:val="single" w:sz="8" w:space="0" w:color="000000"/>
+              <w:left w:val="single" w:sz="8" w:space="0" w:color="000000"/>
+              <w:bottom w:val="single" w:sz="8" w:space="0" w:color="000000"/>
+              <w:right w:val="single" w:sz="8" w:space="0" w:color="000000"/>
+            </w:tcBorders>
+          </w:tcPr>
+          <w:p>
+            <w:pPr>
+              <w:pStyle w:val="Compact"/>
+              <w:widowControl/>
+              <w:spacing w:lineRule="auto" w:line="276" w:before="36" w:after="36"/>
+              <w:jc w:val="right"/>
+              <w:rPr>
+                <w:rFonts w:ascii="Aptos" w:hAnsi="Aptos" w:eastAsia="Aptos" w:cs="Aptos"/>
+                <w:kern w:val="0"/>
+                <w:lang w:val="en-US"/>
+              </w:rPr>
+            </w:pPr>
+            <w:r>
+              <w:rPr>
+                <w:rFonts w:eastAsia="Aptos" w:cs="Aptos"/>
+                <w:kern w:val="0"/>
+                <w:lang w:val="en-US"/>
+              </w:rPr>
+              <w:t>3,490</w:t>
+            </w:r>
+          </w:p>
+        </w:tc>
+        <w:tc>
+          <w:tcPr>
+            <w:tcW w:w="1584" w:type="dxa"/>
+            <w:tcBorders>
+              <w:top w:val="single" w:sz="8" w:space="0" w:color="000000"/>
+              <w:left w:val="single" w:sz="8" w:space="0" w:color="000000"/>
+              <w:bottom w:val="single" w:sz="8" w:space="0" w:color="000000"/>
+              <w:right w:val="single" w:sz="8" w:space="0" w:color="000000"/>
+            </w:tcBorders>
+          </w:tcPr>
+          <w:p>
+            <w:pPr>
+              <w:pStyle w:val="Compact"/>
+              <w:widowControl/>
+              <w:spacing w:lineRule="auto" w:line="276" w:before="36" w:after="36"/>
+              <w:jc w:val="right"/>
+              <w:rPr>
+                <w:rFonts w:ascii="Aptos" w:hAnsi="Aptos" w:eastAsia="Aptos" w:cs="Aptos"/>
+                <w:kern w:val="0"/>
+                <w:lang w:val="en-US"/>
+              </w:rPr>
+            </w:pPr>
+            <w:r>
+              <w:rPr>
+                <w:rFonts w:eastAsia="Aptos" w:cs="Aptos"/>
+                <w:kern w:val="0"/>
+                <w:lang w:val="en-US"/>
+              </w:rPr>
+              <w:t>56.1</w:t>
+            </w:r>
+          </w:p>
+        </w:tc>
+        <w:tc>
+          <w:tcPr>
+            <w:tcW w:w="1584" w:type="dxa"/>
+            <w:tcBorders>
+              <w:top w:val="single" w:sz="8" w:space="0" w:color="000000"/>
+              <w:left w:val="single" w:sz="8" w:space="0" w:color="000000"/>
+              <w:bottom w:val="single" w:sz="8" w:space="0" w:color="000000"/>
+              <w:right w:val="single" w:sz="8" w:space="0" w:color="000000"/>
+            </w:tcBorders>
+          </w:tcPr>
+          <w:p>
+            <w:pPr>
+              <w:pStyle w:val="Compact"/>
+              <w:widowControl/>
+              <w:spacing w:lineRule="auto" w:line="276" w:before="36" w:after="36"/>
+              <w:jc w:val="right"/>
+              <w:rPr>
+                <w:rFonts w:ascii="Aptos" w:hAnsi="Aptos" w:eastAsia="Aptos" w:cs="Aptos"/>
+                <w:kern w:val="0"/>
+                <w:lang w:val="en-US"/>
+              </w:rPr>
+            </w:pPr>
+            <w:r>
+              <w:rPr>
+                <w:rFonts w:eastAsia="Aptos" w:cs="Aptos"/>
+                <w:kern w:val="0"/>
+                <w:lang w:val="en-US"/>
+              </w:rPr>
+              <w:t>56.1</w:t>
+            </w:r>
+          </w:p>
+        </w:tc>
+      </w:tr>
+      <w:tr>
+        <w:trPr/>
+        <w:tc>
+          <w:tcPr>
+            <w:tcW w:w="1584" w:type="dxa"/>
+            <w:tcBorders>
+              <w:top w:val="single" w:sz="8" w:space="0" w:color="000000"/>
+              <w:left w:val="single" w:sz="8" w:space="0" w:color="000000"/>
+              <w:bottom w:val="single" w:sz="8" w:space="0" w:color="000000"/>
+              <w:right w:val="single" w:sz="8" w:space="0" w:color="000000"/>
+            </w:tcBorders>
+          </w:tcPr>
+          <w:p>
+            <w:pPr>
+              <w:pStyle w:val="Compact"/>
+              <w:widowControl/>
+              <w:spacing w:lineRule="auto" w:line="276" w:before="36" w:after="36"/>
+              <w:jc w:val="left"/>
+              <w:rPr>
+                <w:rFonts w:ascii="Aptos" w:hAnsi="Aptos" w:eastAsia="Aptos" w:cs="Aptos"/>
+                <w:kern w:val="0"/>
+                <w:lang w:val="en-US"/>
+              </w:rPr>
+            </w:pPr>
+            <w:r>
+              <w:rPr>
+                <w:rFonts w:eastAsia="Aptos" w:cs="Aptos"/>
+                <w:kern w:val="0"/>
+                <w:lang w:val="en-US"/>
+              </w:rPr>
+              <w:t>Disposal</w:t>
+            </w:r>
+          </w:p>
+        </w:tc>
+        <w:tc>
+          <w:tcPr>
+            <w:tcW w:w="1584" w:type="dxa"/>
+            <w:tcBorders>
+              <w:top w:val="single" w:sz="8" w:space="0" w:color="000000"/>
+              <w:left w:val="single" w:sz="8" w:space="0" w:color="000000"/>
+              <w:bottom w:val="single" w:sz="8" w:space="0" w:color="000000"/>
+              <w:right w:val="single" w:sz="8" w:space="0" w:color="000000"/>
+            </w:tcBorders>
+          </w:tcPr>
+          <w:p>
+            <w:pPr>
+              <w:pStyle w:val="Compact"/>
+              <w:widowControl/>
+              <w:spacing w:lineRule="auto" w:line="276" w:before="36" w:after="36"/>
+              <w:jc w:val="right"/>
+              <w:rPr>
+                <w:rFonts w:ascii="Aptos" w:hAnsi="Aptos" w:eastAsia="Aptos" w:cs="Aptos"/>
+                <w:kern w:val="0"/>
+                <w:lang w:val="en-US"/>
+              </w:rPr>
+            </w:pPr>
+            <w:r>
+              <w:rPr>
+                <w:rFonts w:eastAsia="Aptos" w:cs="Aptos"/>
+                <w:kern w:val="0"/>
+                <w:lang w:val="en-US"/>
+              </w:rPr>
+              <w:t>686</w:t>
+            </w:r>
+          </w:p>
+        </w:tc>
+        <w:tc>
+          <w:tcPr>
+            <w:tcW w:w="1584" w:type="dxa"/>
+            <w:tcBorders>
+              <w:top w:val="single" w:sz="8" w:space="0" w:color="000000"/>
+              <w:left w:val="single" w:sz="8" w:space="0" w:color="000000"/>
+              <w:bottom w:val="single" w:sz="8" w:space="0" w:color="000000"/>
+              <w:right w:val="single" w:sz="8" w:space="0" w:color="000000"/>
+            </w:tcBorders>
+          </w:tcPr>
+          <w:p>
+            <w:pPr>
+              <w:pStyle w:val="Compact"/>
+              <w:widowControl/>
+              <w:spacing w:lineRule="auto" w:line="276" w:before="36" w:after="36"/>
+              <w:jc w:val="right"/>
+              <w:rPr>
+                <w:rFonts w:ascii="Aptos" w:hAnsi="Aptos" w:eastAsia="Aptos" w:cs="Aptos"/>
+                <w:kern w:val="0"/>
+                <w:lang w:val="en-US"/>
+              </w:rPr>
+            </w:pPr>
+            <w:r>
+              <w:rPr>
+                <w:rFonts w:eastAsia="Aptos" w:cs="Aptos"/>
+                <w:kern w:val="0"/>
+                <w:lang w:val="en-US"/>
+              </w:rPr>
+              <w:t>686</w:t>
+            </w:r>
+          </w:p>
+        </w:tc>
+        <w:tc>
+          <w:tcPr>
+            <w:tcW w:w="1584" w:type="dxa"/>
+            <w:tcBorders>
+              <w:top w:val="single" w:sz="8" w:space="0" w:color="000000"/>
+              <w:left w:val="single" w:sz="8" w:space="0" w:color="000000"/>
+              <w:bottom w:val="single" w:sz="8" w:space="0" w:color="000000"/>
+              <w:right w:val="single" w:sz="8" w:space="0" w:color="000000"/>
+            </w:tcBorders>
+          </w:tcPr>
+          <w:p>
+            <w:pPr>
+              <w:pStyle w:val="Compact"/>
+              <w:widowControl/>
+              <w:spacing w:lineRule="auto" w:line="276" w:before="36" w:after="36"/>
+              <w:jc w:val="right"/>
+              <w:rPr>
+                <w:rFonts w:ascii="Aptos" w:hAnsi="Aptos" w:eastAsia="Aptos" w:cs="Aptos"/>
+                <w:kern w:val="0"/>
+                <w:lang w:val="en-US"/>
+              </w:rPr>
+            </w:pPr>
+            <w:r>
+              <w:rPr>
+                <w:rFonts w:eastAsia="Aptos" w:cs="Aptos"/>
+                <w:kern w:val="0"/>
+                <w:lang w:val="en-US"/>
+              </w:rPr>
+              <w:t>9.8</w:t>
+            </w:r>
+          </w:p>
+        </w:tc>
+        <w:tc>
+          <w:tcPr>
+            <w:tcW w:w="1584" w:type="dxa"/>
+            <w:tcBorders>
+              <w:top w:val="single" w:sz="8" w:space="0" w:color="000000"/>
+              <w:left w:val="single" w:sz="8" w:space="0" w:color="000000"/>
+              <w:bottom w:val="single" w:sz="8" w:space="0" w:color="000000"/>
+              <w:right w:val="single" w:sz="8" w:space="0" w:color="000000"/>
+            </w:tcBorders>
+          </w:tcPr>
+          <w:p>
+            <w:pPr>
+              <w:pStyle w:val="Compact"/>
+              <w:widowControl/>
+              <w:spacing w:lineRule="auto" w:line="276" w:before="36" w:after="36"/>
+              <w:jc w:val="right"/>
+              <w:rPr>
+                <w:rFonts w:ascii="Aptos" w:hAnsi="Aptos" w:eastAsia="Aptos" w:cs="Aptos"/>
+                <w:kern w:val="0"/>
+                <w:lang w:val="en-US"/>
+              </w:rPr>
+            </w:pPr>
+            <w:r>
+              <w:rPr>
+                <w:rFonts w:eastAsia="Aptos" w:cs="Aptos"/>
+                <w:kern w:val="0"/>
+                <w:lang w:val="en-US"/>
+              </w:rPr>
+              <w:t>9.8</w:t>
+            </w:r>
+          </w:p>
+        </w:tc>
+      </w:tr>
+      <w:tr>
+        <w:trPr/>
+        <w:tc>
+          <w:tcPr>
+            <w:tcW w:w="1584" w:type="dxa"/>
+            <w:tcBorders>
+              <w:top w:val="single" w:sz="8" w:space="0" w:color="000000"/>
+              <w:left w:val="single" w:sz="8" w:space="0" w:color="000000"/>
+              <w:bottom w:val="single" w:sz="8" w:space="0" w:color="000000"/>
+              <w:right w:val="single" w:sz="8" w:space="0" w:color="000000"/>
+            </w:tcBorders>
+          </w:tcPr>
+          <w:p>
+            <w:pPr>
+              <w:pStyle w:val="Compact"/>
+              <w:widowControl/>
+              <w:spacing w:lineRule="auto" w:line="276" w:before="36" w:after="36"/>
+              <w:jc w:val="left"/>
+              <w:rPr>
+                <w:rFonts w:ascii="Aptos" w:hAnsi="Aptos" w:eastAsia="Aptos" w:cs="Aptos"/>
+                <w:kern w:val="0"/>
+                <w:lang w:val="en-US"/>
+              </w:rPr>
+            </w:pPr>
+            <w:r>
+              <w:rPr>
+                <w:rFonts w:eastAsia="Aptos" w:cs="Aptos"/>
+                <w:kern w:val="0"/>
+                <w:lang w:val="en-US"/>
+              </w:rPr>
+              <w:t>Total, first life</w:t>
+            </w:r>
+          </w:p>
+        </w:tc>
+        <w:tc>
+          <w:tcPr>
+            <w:tcW w:w="1584" w:type="dxa"/>
+            <w:tcBorders>
+              <w:top w:val="single" w:sz="8" w:space="0" w:color="000000"/>
+              <w:left w:val="single" w:sz="8" w:space="0" w:color="000000"/>
+              <w:bottom w:val="single" w:sz="8" w:space="0" w:color="000000"/>
+              <w:right w:val="single" w:sz="8" w:space="0" w:color="000000"/>
+            </w:tcBorders>
+          </w:tcPr>
+          <w:p>
+            <w:pPr>
+              <w:pStyle w:val="Compact"/>
+              <w:widowControl/>
+              <w:spacing w:lineRule="auto" w:line="276" w:before="36" w:after="36"/>
+              <w:jc w:val="right"/>
+              <w:rPr>
+                <w:rFonts w:ascii="Aptos" w:hAnsi="Aptos" w:eastAsia="Aptos" w:cs="Aptos"/>
+                <w:kern w:val="0"/>
+                <w:lang w:val="en-US"/>
+              </w:rPr>
+            </w:pPr>
+            <w:r>
+              <w:rPr>
+                <w:rFonts w:eastAsia="Aptos" w:cs="Aptos"/>
+                <w:kern w:val="0"/>
+                <w:lang w:val="en-US"/>
+              </w:rPr>
+              <w:t>58,900</w:t>
+            </w:r>
+          </w:p>
+        </w:tc>
+        <w:tc>
+          <w:tcPr>
+            <w:tcW w:w="1584" w:type="dxa"/>
+            <w:tcBorders>
+              <w:top w:val="single" w:sz="8" w:space="0" w:color="000000"/>
+              <w:left w:val="single" w:sz="8" w:space="0" w:color="000000"/>
+              <w:bottom w:val="single" w:sz="8" w:space="0" w:color="000000"/>
+              <w:right w:val="single" w:sz="8" w:space="0" w:color="000000"/>
+            </w:tcBorders>
+          </w:tcPr>
+          <w:p>
+            <w:pPr>
+              <w:pStyle w:val="Compact"/>
+              <w:widowControl/>
+              <w:spacing w:lineRule="auto" w:line="276" w:before="36" w:after="36"/>
+              <w:jc w:val="right"/>
+              <w:rPr>
+                <w:rFonts w:ascii="Aptos" w:hAnsi="Aptos" w:eastAsia="Aptos" w:cs="Aptos"/>
+                <w:kern w:val="0"/>
+                <w:lang w:val="en-US"/>
+              </w:rPr>
+            </w:pPr>
+            <w:r>
+              <w:rPr>
+                <w:rFonts w:eastAsia="Aptos" w:cs="Aptos"/>
+                <w:kern w:val="0"/>
+                <w:lang w:val="en-US"/>
+              </w:rPr>
+              <w:t>58,600</w:t>
+            </w:r>
+          </w:p>
+        </w:tc>
+        <w:tc>
+          <w:tcPr>
+            <w:tcW w:w="1584" w:type="dxa"/>
+            <w:tcBorders>
+              <w:top w:val="single" w:sz="8" w:space="0" w:color="000000"/>
+              <w:left w:val="single" w:sz="8" w:space="0" w:color="000000"/>
+              <w:bottom w:val="single" w:sz="8" w:space="0" w:color="000000"/>
+              <w:right w:val="single" w:sz="8" w:space="0" w:color="000000"/>
+            </w:tcBorders>
+          </w:tcPr>
+          <w:p>
+            <w:pPr>
+              <w:pStyle w:val="Compact"/>
+              <w:widowControl/>
+              <w:spacing w:lineRule="auto" w:line="276" w:before="36" w:after="36"/>
+              <w:jc w:val="right"/>
+              <w:rPr>
+                <w:rFonts w:ascii="Aptos" w:hAnsi="Aptos" w:eastAsia="Aptos" w:cs="Aptos"/>
+                <w:kern w:val="0"/>
+                <w:lang w:val="en-US"/>
+              </w:rPr>
+            </w:pPr>
+            <w:r>
+              <w:rPr>
+                <w:rFonts w:eastAsia="Aptos" w:cs="Aptos"/>
+                <w:kern w:val="0"/>
+                <w:lang w:val="en-US"/>
+              </w:rPr>
+              <w:t>660</w:t>
+            </w:r>
+          </w:p>
+        </w:tc>
+        <w:tc>
+          <w:tcPr>
+            <w:tcW w:w="1584" w:type="dxa"/>
+            <w:tcBorders>
+              <w:top w:val="single" w:sz="8" w:space="0" w:color="000000"/>
+              <w:left w:val="single" w:sz="8" w:space="0" w:color="000000"/>
+              <w:bottom w:val="single" w:sz="8" w:space="0" w:color="000000"/>
+              <w:right w:val="single" w:sz="8" w:space="0" w:color="000000"/>
+            </w:tcBorders>
+          </w:tcPr>
+          <w:p>
+            <w:pPr>
+              <w:pStyle w:val="Compact"/>
+              <w:widowControl/>
+              <w:spacing w:lineRule="auto" w:line="276" w:before="36" w:after="36"/>
+              <w:jc w:val="right"/>
+              <w:rPr>
+                <w:rFonts w:ascii="Aptos" w:hAnsi="Aptos" w:eastAsia="Aptos" w:cs="Aptos"/>
+                <w:kern w:val="0"/>
+                <w:lang w:val="en-US"/>
+              </w:rPr>
+            </w:pPr>
+            <w:r>
+              <w:rPr>
+                <w:rFonts w:eastAsia="Aptos" w:cs="Aptos"/>
+                <w:kern w:val="0"/>
+                <w:lang w:val="en-US"/>
+              </w:rPr>
+              <w:t>646</w:t>
+            </w:r>
+          </w:p>
+        </w:tc>
+      </w:tr>
+      <w:tr>
+        <w:trPr/>
+        <w:tc>
+          <w:tcPr>
+            <w:tcW w:w="1584" w:type="dxa"/>
+            <w:tcBorders>
+              <w:top w:val="single" w:sz="8" w:space="0" w:color="000000"/>
+              <w:left w:val="single" w:sz="8" w:space="0" w:color="000000"/>
+              <w:bottom w:val="single" w:sz="8" w:space="0" w:color="000000"/>
+              <w:right w:val="single" w:sz="8" w:space="0" w:color="000000"/>
+            </w:tcBorders>
+          </w:tcPr>
+          <w:p>
+            <w:pPr>
+              <w:pStyle w:val="Compact"/>
+              <w:widowControl/>
+              <w:spacing w:lineRule="auto" w:line="276" w:before="36" w:after="36"/>
+              <w:jc w:val="left"/>
+              <w:rPr>
+                <w:rFonts w:ascii="Aptos" w:hAnsi="Aptos" w:eastAsia="Aptos" w:cs="Aptos"/>
+                <w:kern w:val="0"/>
+                <w:lang w:val="en-US"/>
+              </w:rPr>
+            </w:pPr>
+            <w:r>
+              <w:rPr>
+                <w:rFonts w:eastAsia="Aptos" w:cs="Aptos"/>
+                <w:kern w:val="0"/>
+                <w:lang w:val="en-US"/>
+              </w:rPr>
+              <w:t>End-of-life potential (steel recycling)</w:t>
+            </w:r>
+          </w:p>
+        </w:tc>
+        <w:tc>
+          <w:tcPr>
+            <w:tcW w:w="1584" w:type="dxa"/>
+            <w:tcBorders>
+              <w:top w:val="single" w:sz="8" w:space="0" w:color="000000"/>
+              <w:left w:val="single" w:sz="8" w:space="0" w:color="000000"/>
+              <w:bottom w:val="single" w:sz="8" w:space="0" w:color="000000"/>
+              <w:right w:val="single" w:sz="8" w:space="0" w:color="000000"/>
+            </w:tcBorders>
+          </w:tcPr>
+          <w:p>
+            <w:pPr>
+              <w:pStyle w:val="Compact"/>
+              <w:widowControl/>
+              <w:spacing w:lineRule="auto" w:line="276" w:before="36" w:after="36"/>
+              <w:jc w:val="right"/>
+              <w:rPr>
+                <w:rFonts w:ascii="Aptos" w:hAnsi="Aptos" w:eastAsia="Aptos" w:cs="Aptos"/>
+                <w:kern w:val="0"/>
+                <w:lang w:val="en-US"/>
+              </w:rPr>
+            </w:pPr>
+            <w:r>
+              <w:rPr>
+                <w:rFonts w:eastAsia="Aptos" w:cs="Aptos"/>
+                <w:kern w:val="0"/>
+                <w:lang w:val="en-US"/>
+              </w:rPr>
+              <w:t>−</w:t>
+            </w:r>
+            <w:r>
+              <w:rPr>
+                <w:rFonts w:eastAsia="Aptos" w:cs="Aptos"/>
+                <w:kern w:val="0"/>
+                <w:lang w:val="en-US"/>
+              </w:rPr>
+              <w:t>23,400</w:t>
+            </w:r>
+          </w:p>
+        </w:tc>
+        <w:tc>
+          <w:tcPr>
+            <w:tcW w:w="1584" w:type="dxa"/>
+            <w:tcBorders>
+              <w:top w:val="single" w:sz="8" w:space="0" w:color="000000"/>
+              <w:left w:val="single" w:sz="8" w:space="0" w:color="000000"/>
+              <w:bottom w:val="single" w:sz="8" w:space="0" w:color="000000"/>
+              <w:right w:val="single" w:sz="8" w:space="0" w:color="000000"/>
+            </w:tcBorders>
+          </w:tcPr>
+          <w:p>
+            <w:pPr>
+              <w:pStyle w:val="Compact"/>
+              <w:widowControl/>
+              <w:spacing w:lineRule="auto" w:line="276" w:before="36" w:after="36"/>
+              <w:jc w:val="right"/>
+              <w:rPr>
+                <w:rFonts w:ascii="Aptos" w:hAnsi="Aptos" w:eastAsia="Aptos" w:cs="Aptos"/>
+                <w:kern w:val="0"/>
+                <w:lang w:val="en-US"/>
+              </w:rPr>
+            </w:pPr>
+            <w:r>
+              <w:rPr>
+                <w:rFonts w:eastAsia="Aptos" w:cs="Aptos"/>
+                <w:kern w:val="0"/>
+                <w:lang w:val="en-US"/>
+              </w:rPr>
+              <w:t>−</w:t>
+            </w:r>
+            <w:r>
+              <w:rPr>
+                <w:rFonts w:eastAsia="Aptos" w:cs="Aptos"/>
+                <w:kern w:val="0"/>
+                <w:lang w:val="en-US"/>
+              </w:rPr>
+              <w:t>23,400</w:t>
+            </w:r>
+          </w:p>
+        </w:tc>
+        <w:tc>
+          <w:tcPr>
+            <w:tcW w:w="1584" w:type="dxa"/>
+            <w:tcBorders>
+              <w:top w:val="single" w:sz="8" w:space="0" w:color="000000"/>
+              <w:left w:val="single" w:sz="8" w:space="0" w:color="000000"/>
+              <w:bottom w:val="single" w:sz="8" w:space="0" w:color="000000"/>
+              <w:right w:val="single" w:sz="8" w:space="0" w:color="000000"/>
+            </w:tcBorders>
+          </w:tcPr>
+          <w:p>
+            <w:pPr>
+              <w:pStyle w:val="Compact"/>
+              <w:widowControl/>
+              <w:spacing w:lineRule="auto" w:line="276" w:before="36" w:after="36"/>
+              <w:jc w:val="right"/>
+              <w:rPr>
+                <w:rFonts w:ascii="Aptos" w:hAnsi="Aptos" w:eastAsia="Aptos" w:cs="Aptos"/>
+                <w:kern w:val="0"/>
+                <w:lang w:val="en-US"/>
+              </w:rPr>
+            </w:pPr>
+            <w:r>
+              <w:rPr>
+                <w:rFonts w:eastAsia="Aptos" w:cs="Aptos"/>
+                <w:kern w:val="0"/>
+                <w:lang w:val="en-US"/>
+              </w:rPr>
+              <w:t>−</w:t>
+            </w:r>
+            <w:r>
+              <w:rPr>
+                <w:rFonts w:eastAsia="Aptos" w:cs="Aptos"/>
+                <w:kern w:val="0"/>
+                <w:lang w:val="en-US"/>
+              </w:rPr>
+              <w:t>328</w:t>
+            </w:r>
+          </w:p>
+        </w:tc>
+        <w:tc>
+          <w:tcPr>
+            <w:tcW w:w="1584" w:type="dxa"/>
+            <w:tcBorders>
+              <w:top w:val="single" w:sz="8" w:space="0" w:color="000000"/>
+              <w:left w:val="single" w:sz="8" w:space="0" w:color="000000"/>
+              <w:bottom w:val="single" w:sz="8" w:space="0" w:color="000000"/>
+              <w:right w:val="single" w:sz="8" w:space="0" w:color="000000"/>
+            </w:tcBorders>
+          </w:tcPr>
+          <w:p>
+            <w:pPr>
+              <w:pStyle w:val="Compact"/>
+              <w:widowControl/>
+              <w:spacing w:lineRule="auto" w:line="276" w:before="36" w:after="36"/>
+              <w:jc w:val="right"/>
+              <w:rPr>
+                <w:rFonts w:ascii="Aptos" w:hAnsi="Aptos" w:eastAsia="Aptos" w:cs="Aptos"/>
+                <w:kern w:val="0"/>
+                <w:lang w:val="en-US"/>
+              </w:rPr>
+            </w:pPr>
+            <w:r>
+              <w:rPr>
+                <w:rFonts w:eastAsia="Aptos" w:cs="Aptos"/>
+                <w:kern w:val="0"/>
+                <w:lang w:val="en-US"/>
+              </w:rPr>
+              <w:t>−</w:t>
+            </w:r>
+            <w:r>
+              <w:rPr>
+                <w:rFonts w:eastAsia="Aptos" w:cs="Aptos"/>
+                <w:kern w:val="0"/>
+                <w:lang w:val="en-US"/>
+              </w:rPr>
+              <w:t>328</w:t>
+            </w:r>
+          </w:p>
+        </w:tc>
+      </w:tr>
+    </w:tbl>
+    <w:p>
+      <w:pPr>
+        <w:pStyle w:val="BodyText"/>
+        <w:rPr/>
+      </w:pPr>
+      <w:r>
+        <w:rPr/>
+        <w:t>The concrete-only saving is (0.1583 − 0.1533) × 48,000 t = 240 t CO₂e; at Pillai et al.’s (2019) 0.1125 kg/kg it would be (0.1583 − 0.1125) × 48,000 t = 2,198 t, the 2,200 t used in the report. Spread over the 60-year functional unit, Granta’s 58,900 t is 0.42 g CO₂e/kWh, against 0.50 g/kWh for construction in our model.</w:t>
+      </w:r>
+    </w:p>
+    <w:p>
+      <w:pPr>
+        <w:pStyle w:val="CaptionedFigure"/>
+        <w:rPr/>
+      </w:pPr>
+      <w:r>
+        <w:rPr/>
+        <w:drawing>
+          <wp:inline distT="0" distB="0" distL="0" distR="0">
+            <wp:extent cx="4664075" cy="3436620"/>
+            <wp:effectExtent l="0" t="0" r="0" b="0"/>
+            <wp:docPr id="9" name="Image9" descr="Figure F9. Granta EduPack Eco Audit summary, climate change (kg CO₂e) by life phase: base reactor against LC³ reactor. Source: Granta EduPack 2024 R1, team model."/>
+            <wp:cNvGraphicFramePr>
+              <a:graphicFrameLocks xmlns:a="http://schemas.openxmlformats.org/drawingml/2006/main" noChangeAspect="1"/>
+            </wp:cNvGraphicFramePr>
+            <a:graphic xmlns:a="http://schemas.openxmlformats.org/drawingml/2006/main">
+              <a:graphicData uri="http://schemas.openxmlformats.org/drawingml/2006/picture">
+                <pic:pic xmlns:pic="http://schemas.openxmlformats.org/drawingml/2006/picture">
+                  <pic:nvPicPr>
+                    <pic:cNvPr id="9" name="Image9" descr="Figure F9. Granta EduPack Eco Audit summary, climate change (kg CO₂e) by life phase: base reactor against LC³ reactor. Source: Granta EduPack 2024 R1, team model."/>
+                    <pic:cNvPicPr>
+                      <a:picLocks noChangeAspect="1" noChangeArrowheads="1"/>
+                    </pic:cNvPicPr>
+                  </pic:nvPicPr>
+                  <pic:blipFill>
+                    <a:blip r:embed="rId10"/>
+                    <a:stretch>
+                      <a:fillRect/>
+                    </a:stretch>
+                  </pic:blipFill>
+                  <pic:spPr bwMode="auto">
+                    <a:xfrm>
+                      <a:off x="0" y="0"/>
+                      <a:ext cx="4664075" cy="3436620"/>
+                    </a:xfrm>
+                    <a:prstGeom prst="rect">
+                      <a:avLst/>
+                    </a:prstGeom>
+                  </pic:spPr>
+                </pic:pic>
+              </a:graphicData>
+            </a:graphic>
+          </wp:inline>
+        </w:drawing>
+      </w:r>
+    </w:p>
+    <w:p>
+      <w:pPr>
+        <w:pStyle w:val="ImageCaption"/>
+        <w:rPr/>
+      </w:pPr>
+      <w:r>
+        <w:rPr/>
+        <w:t>Figure F9. Granta EduPack Eco Audit summary, climate change (kg CO₂e) by life phase: base reactor against LC³ reactor. Source: Granta EduPack 2024 R1, team model.</w:t>
+      </w:r>
+    </w:p>
+    <w:p>
+      <w:pPr>
+        <w:pStyle w:val="CaptionedFigure"/>
+        <w:rPr/>
+      </w:pPr>
+      <w:r>
+        <w:rPr/>
+        <w:drawing>
+          <wp:inline distT="0" distB="0" distL="0" distR="0">
+            <wp:extent cx="4664075" cy="3436620"/>
+            <wp:effectExtent l="0" t="0" r="0" b="0"/>
+            <wp:docPr id="10" name="Image10" descr="Figure F10. Granta EduPack Eco Audit summary, energy (MJ) by life phase: base reactor against LC³ reactor. Source: Granta EduPack 2024 R1, team model."/>
+            <wp:cNvGraphicFramePr>
+              <a:graphicFrameLocks xmlns:a="http://schemas.openxmlformats.org/drawingml/2006/main" noChangeAspect="1"/>
+            </wp:cNvGraphicFramePr>
+            <a:graphic xmlns:a="http://schemas.openxmlformats.org/drawingml/2006/main">
+              <a:graphicData uri="http://schemas.openxmlformats.org/drawingml/2006/picture">
+                <pic:pic xmlns:pic="http://schemas.openxmlformats.org/drawingml/2006/picture">
+                  <pic:nvPicPr>
+                    <pic:cNvPr id="10" name="Image10" descr="Figure F10. Granta EduPack Eco Audit summary, energy (MJ) by life phase: base reactor against LC³ reactor. Source: Granta EduPack 2024 R1, team model."/>
+                    <pic:cNvPicPr>
+                      <a:picLocks noChangeAspect="1" noChangeArrowheads="1"/>
+                    </pic:cNvPicPr>
+                  </pic:nvPicPr>
+                  <pic:blipFill>
+                    <a:blip r:embed="rId11"/>
+                    <a:stretch>
+                      <a:fillRect/>
+                    </a:stretch>
+                  </pic:blipFill>
+                  <pic:spPr bwMode="auto">
+                    <a:xfrm>
+                      <a:off x="0" y="0"/>
+                      <a:ext cx="4664075" cy="3436620"/>
+                    </a:xfrm>
+                    <a:prstGeom prst="rect">
+                      <a:avLst/>
+                    </a:prstGeom>
+                  </pic:spPr>
+                </pic:pic>
+              </a:graphicData>
+            </a:graphic>
+          </wp:inline>
+        </w:drawing>
+      </w:r>
+    </w:p>
+    <w:p>
+      <w:pPr>
+        <w:pStyle w:val="ImageCaption"/>
+        <w:rPr/>
+      </w:pPr>
+      <w:r>
+        <w:rPr/>
+        <w:t>Figure F10. Granta EduPack Eco Audit summary, energy (MJ) by life phase: base reactor against LC³ reactor. Source: Granta EduPack 2024 R1, team model.</w:t>
       </w:r>
     </w:p>
     <w:p>
@@ -27791,12 +29126,12 @@
       </w:r>
     </w:p>
     <w:sectPr>
-      <w:headerReference w:type="even" r:id="rId10"/>
-      <w:headerReference w:type="default" r:id="rId11"/>
-      <w:headerReference w:type="first" r:id="rId12"/>
-      <w:footerReference w:type="even" r:id="rId13"/>
-      <w:footerReference w:type="default" r:id="rId14"/>
-      <w:footerReference w:type="first" r:id="rId15"/>
+      <w:headerReference w:type="even" r:id="rId12"/>
+      <w:headerReference w:type="default" r:id="rId13"/>
+      <w:headerReference w:type="first" r:id="rId14"/>
+      <w:footerReference w:type="even" r:id="rId15"/>
+      <w:footerReference w:type="default" r:id="rId16"/>
+      <w:footerReference w:type="first" r:id="rId17"/>
       <w:type w:val="nextPage"/>
       <w:pgSz w:w="11906" w:h="16838"/>
       <w:pgMar w:left="1440" w:right="1440" w:gutter="0" w:header="720" w:top="1440" w:footer="720" w:bottom="1440"/>
@@ -27873,7 +29208,7 @@
     </w:r>
     <w:r>
       <w:rPr/>
-      <w:t>51</w:t>
+      <w:t>52</w:t>
     </w:r>
     <w:r>
       <w:rPr/>
@@ -27930,7 +29265,7 @@
     <w:r>
       <w:rPr/>
       <w:drawing>
-        <wp:anchor behindDoc="1" distT="0" distB="0" distL="0" distR="0" simplePos="0" locked="0" layoutInCell="0" allowOverlap="1" relativeHeight="61">
+        <wp:anchor behindDoc="1" distT="0" distB="0" distL="0" distR="0" simplePos="0" locked="0" layoutInCell="0" allowOverlap="1" relativeHeight="64">
           <wp:simplePos x="0" y="0"/>
           <wp:positionH relativeFrom="margin">
             <wp:posOffset>4845050</wp:posOffset>
@@ -27941,7 +29276,7 @@
           <wp:extent cx="887730" cy="318135"/>
           <wp:effectExtent l="0" t="0" r="0" b="0"/>
           <wp:wrapNone/>
-          <wp:docPr id="9" name="image2.png" descr=""/>
+          <wp:docPr id="11" name="image2.png" descr=""/>
           <wp:cNvGraphicFramePr>
             <a:graphicFrameLocks xmlns:a="http://schemas.openxmlformats.org/drawingml/2006/main" noChangeAspect="1"/>
           </wp:cNvGraphicFramePr>
@@ -27949,7 +29284,7 @@
             <a:graphicData uri="http://schemas.openxmlformats.org/drawingml/2006/picture">
               <pic:pic xmlns:pic="http://schemas.openxmlformats.org/drawingml/2006/picture">
                 <pic:nvPicPr>
-                  <pic:cNvPr id="9" name="image2.png" descr=""/>
+                  <pic:cNvPr id="11" name="image2.png" descr=""/>
                   <pic:cNvPicPr>
                     <a:picLocks noChangeAspect="1" noChangeArrowheads="1"/>
                   </pic:cNvPicPr>
@@ -27975,7 +29310,7 @@
         </wp:anchor>
       </w:drawing>
       <w:drawing>
-        <wp:anchor behindDoc="1" distT="0" distB="0" distL="0" distR="0" simplePos="0" locked="0" layoutInCell="0" allowOverlap="1" relativeHeight="112">
+        <wp:anchor behindDoc="1" distT="0" distB="0" distL="0" distR="0" simplePos="0" locked="0" layoutInCell="0" allowOverlap="1" relativeHeight="117">
           <wp:simplePos x="0" y="0"/>
           <wp:positionH relativeFrom="page">
             <wp:posOffset>752475</wp:posOffset>
@@ -27986,7 +29321,7 @@
           <wp:extent cx="1401445" cy="595630"/>
           <wp:effectExtent l="0" t="0" r="0" b="0"/>
           <wp:wrapNone/>
-          <wp:docPr id="10" name="image1.png" descr=""/>
+          <wp:docPr id="12" name="image1.png" descr=""/>
           <wp:cNvGraphicFramePr>
             <a:graphicFrameLocks xmlns:a="http://schemas.openxmlformats.org/drawingml/2006/main" noChangeAspect="1"/>
           </wp:cNvGraphicFramePr>
@@ -27994,7 +29329,7 @@
             <a:graphicData uri="http://schemas.openxmlformats.org/drawingml/2006/picture">
               <pic:pic xmlns:pic="http://schemas.openxmlformats.org/drawingml/2006/picture">
                 <pic:nvPicPr>
-                  <pic:cNvPr id="10" name="image1.png" descr=""/>
+                  <pic:cNvPr id="12" name="image1.png" descr=""/>
                   <pic:cNvPicPr>
                     <a:picLocks noChangeAspect="1" noChangeArrowheads="1"/>
                   </pic:cNvPicPr>
@@ -28038,7 +29373,7 @@
     <w:r>
       <w:rPr/>
       <w:drawing>
-        <wp:anchor behindDoc="1" distT="0" distB="0" distL="0" distR="0" simplePos="0" locked="0" layoutInCell="0" allowOverlap="1" relativeHeight="9">
+        <wp:anchor behindDoc="1" distT="0" distB="0" distL="0" distR="0" simplePos="0" locked="0" layoutInCell="0" allowOverlap="1" relativeHeight="11">
           <wp:simplePos x="0" y="0"/>
           <wp:positionH relativeFrom="page">
             <wp:posOffset>752475</wp:posOffset>
@@ -28049,7 +29384,7 @@
           <wp:extent cx="1401445" cy="595630"/>
           <wp:effectExtent l="0" t="0" r="0" b="0"/>
           <wp:wrapNone/>
-          <wp:docPr id="11" name="Image10" descr=""/>
+          <wp:docPr id="13" name="Image12" descr=""/>
           <wp:cNvGraphicFramePr>
             <a:graphicFrameLocks xmlns:a="http://schemas.openxmlformats.org/drawingml/2006/main" noChangeAspect="1"/>
           </wp:cNvGraphicFramePr>
@@ -28057,7 +29392,7 @@
             <a:graphicData uri="http://schemas.openxmlformats.org/drawingml/2006/picture">
               <pic:pic xmlns:pic="http://schemas.openxmlformats.org/drawingml/2006/picture">
                 <pic:nvPicPr>
-                  <pic:cNvPr id="11" name="Image10" descr=""/>
+                  <pic:cNvPr id="13" name="Image12" descr=""/>
                   <pic:cNvPicPr>
                     <a:picLocks noChangeAspect="1" noChangeArrowheads="1"/>
                   </pic:cNvPicPr>
@@ -28083,7 +29418,7 @@
         </wp:anchor>
       </w:drawing>
       <w:drawing>
-        <wp:anchor behindDoc="1" distT="114300" distB="114300" distL="114300" distR="114300" simplePos="0" locked="0" layoutInCell="0" allowOverlap="1" relativeHeight="10">
+        <wp:anchor behindDoc="1" distT="114300" distB="114300" distL="114300" distR="114300" simplePos="0" locked="0" layoutInCell="0" allowOverlap="1" relativeHeight="12">
           <wp:simplePos x="0" y="0"/>
           <wp:positionH relativeFrom="margin">
             <wp:posOffset>4845050</wp:posOffset>
@@ -28094,7 +29429,7 @@
           <wp:extent cx="887730" cy="318135"/>
           <wp:effectExtent l="0" t="0" r="0" b="0"/>
           <wp:wrapSquare wrapText="bothSides"/>
-          <wp:docPr id="12" name="Image9" descr=""/>
+          <wp:docPr id="14" name="Image11" descr=""/>
           <wp:cNvGraphicFramePr>
             <a:graphicFrameLocks xmlns:a="http://schemas.openxmlformats.org/drawingml/2006/main" noChangeAspect="1"/>
           </wp:cNvGraphicFramePr>
@@ -28102,7 +29437,7 @@
             <a:graphicData uri="http://schemas.openxmlformats.org/drawingml/2006/picture">
               <pic:pic xmlns:pic="http://schemas.openxmlformats.org/drawingml/2006/picture">
                 <pic:nvPicPr>
-                  <pic:cNvPr id="12" name="Image9" descr=""/>
+                  <pic:cNvPr id="14" name="Image11" descr=""/>
                   <pic:cNvPicPr>
                     <a:picLocks noChangeAspect="1" noChangeArrowheads="1"/>
                   </pic:cNvPicPr>

</xml_diff>

<commit_message>
Granta reconciliation: LC3 record back-calculated, pre-set checks (pass/fail), Monte Carlo on the C1 saving; Section 3.2, Appendix A9.1 and Conclusion updated
Co-Authored-By: Claude Opus 5.5 <noreply@anthropic.com>
Claude-Session: https://claude.ai/code/session_01SZLM437PwZArBFHgvvPCk4
</commit_message>
<xml_diff>
--- a/01_Report/MTE4593 Group 9 SMR Report - TEAM REVIEW.docx
+++ b/01_Report/MTE4593 Group 9 SMR Report - TEAM REVIEW.docx
@@ -747,7 +747,7 @@
             </w:rPr>
             <w:t>3.4 Stakeholder Analysis</w:t>
             <w:tab/>
-            <w:t>17</w:t>
+            <w:t>18</w:t>
           </w:r>
         </w:p>
         <w:p>
@@ -766,7 +766,7 @@
             </w:rPr>
             <w:t>3.4.1 Stakeholders and Money Flows</w:t>
             <w:tab/>
-            <w:t>17</w:t>
+            <w:t>18</w:t>
           </w:r>
         </w:p>
         <w:p>
@@ -785,7 +785,7 @@
             </w:rPr>
             <w:t>3.4.2 Social Licence</w:t>
             <w:tab/>
-            <w:t>19</w:t>
+            <w:t>20</w:t>
           </w:r>
         </w:p>
         <w:p>
@@ -861,7 +861,7 @@
             </w:rPr>
             <w:t>3.6 Government Regulations Review</w:t>
             <w:tab/>
-            <w:t>24</w:t>
+            <w:t>25</w:t>
           </w:r>
         </w:p>
         <w:p>
@@ -880,7 +880,7 @@
             </w:rPr>
             <w:t>3.6.1 Law, Regulation and Licensing</w:t>
             <w:tab/>
-            <w:t>24</w:t>
+            <w:t>25</w:t>
           </w:r>
         </w:p>
         <w:p>
@@ -899,7 +899,7 @@
             </w:rPr>
             <w:t>3.6.2 Implementation Pathway</w:t>
             <w:tab/>
-            <w:t>25</w:t>
+            <w:t>26</w:t>
           </w:r>
         </w:p>
         <w:p>
@@ -918,7 +918,7 @@
             </w:rPr>
             <w:t>3.7 Triple Bottom Line and Multi-Criteria Analysis</w:t>
             <w:tab/>
-            <w:t>27</w:t>
+            <w:t>28</w:t>
           </w:r>
         </w:p>
         <w:p>
@@ -937,7 +937,7 @@
             </w:rPr>
             <w:t>3.7.1 Triple Bottom Line</w:t>
             <w:tab/>
-            <w:t>27</w:t>
+            <w:t>28</w:t>
           </w:r>
         </w:p>
         <w:p>
@@ -956,7 +956,7 @@
             </w:rPr>
             <w:t>3.7.2 Multi-Criteria Analysis</w:t>
             <w:tab/>
-            <w:t>28</w:t>
+            <w:t>29</w:t>
           </w:r>
         </w:p>
         <w:p>
@@ -975,7 +975,7 @@
             </w:rPr>
             <w:t>3.7.3 Verdict and Limits</w:t>
             <w:tab/>
-            <w:t>29</w:t>
+            <w:t>30</w:t>
           </w:r>
         </w:p>
         <w:p>
@@ -994,7 +994,7 @@
             </w:rPr>
             <w:t>3.8 Future Material Properties and Processes</w:t>
             <w:tab/>
-            <w:t>29</w:t>
+            <w:t>30</w:t>
           </w:r>
         </w:p>
         <w:p>
@@ -1013,7 +1013,7 @@
             </w:rPr>
             <w:t>4 Conclusion</w:t>
             <w:tab/>
-            <w:t>30</w:t>
+            <w:t>31</w:t>
           </w:r>
         </w:p>
         <w:p>
@@ -1032,7 +1032,7 @@
             </w:rPr>
             <w:t>5 References</w:t>
             <w:tab/>
-            <w:t>31</w:t>
+            <w:t>32</w:t>
           </w:r>
         </w:p>
         <w:p>
@@ -1051,7 +1051,7 @@
             </w:rPr>
             <w:t>Declaration of generative AI use</w:t>
             <w:tab/>
-            <w:t>42</w:t>
+            <w:t>43</w:t>
           </w:r>
         </w:p>
         <w:p>
@@ -1070,7 +1070,7 @@
             </w:rPr>
             <w:t>Appendices</w:t>
             <w:tab/>
-            <w:t>43</w:t>
+            <w:t>44</w:t>
           </w:r>
         </w:p>
         <w:p>
@@ -1089,7 +1089,7 @@
             </w:rPr>
             <w:t>Appendix A. LCA inventory and calculations</w:t>
             <w:tab/>
-            <w:t>43</w:t>
+            <w:t>44</w:t>
           </w:r>
         </w:p>
         <w:p>
@@ -1108,7 +1108,7 @@
             </w:rPr>
             <w:t>Appendix B. Policy, economics and supply calculations</w:t>
             <w:tab/>
-            <w:t>47</w:t>
+            <w:t>48</w:t>
           </w:r>
         </w:p>
         <w:p>
@@ -1127,7 +1127,7 @@
             </w:rPr>
             <w:t>Appendix C. Sensitivity analysis</w:t>
             <w:tab/>
-            <w:t>50</w:t>
+            <w:t>52</w:t>
           </w:r>
         </w:p>
         <w:p>
@@ -1146,7 +1146,7 @@
             </w:rPr>
             <w:t>Appendix E. Search log</w:t>
             <w:tab/>
-            <w:t>51</w:t>
+            <w:t>53</w:t>
           </w:r>
           <w:r>
             <w:rPr>
@@ -5336,7 +5336,7 @@
       </w:pPr>
       <w:r>
         <w:rPr/>
-        <w:t>A reproducible Python model multiplies quantities by published emission factors (Appendices A and C). Plant quantities come from the Ostrołęka project information sheet (BWRX-300 Ostrołęka sp. z o.o., 2023, as reported): 50,000 m³ of concrete and 14,000 t of steel per unit, a design proxy, not confirmed Darlington quantities. A bottom-up scaling (20,700 m³; Peterson, Zhao and Petroski, 2005) is a cross-check (Appendix A3). Granta EduPack cross-check. A Granta EduPack 2024 Eco Audit of one unit’s construction materials (120,000 t of concrete and 14,000 t of steel, with transport and steel recycling at end of life) gives 58,900 t CO₂e and 660 TJ for the first life, within about 2% of our scripted construction total of 57,600 t (Appendix A9, Figure F9). With the team’s LC³ material record (0.153 kg CO₂e/kg, against 0.158 for the base concrete), Granta’s saving is only about 240 t (−0.5%), because that record does not carry Pillai et al.’s (2019) 29% reduction; at Pillai’s 270 kg CO₂e/m³ (0.1125 kg/kg) the same model gives 2,200 t, matching our result. Granta also shows LC³’s embodied energy 33% lower per kilogram (0.60 against 0.90 MJ/kg), about 14 TJ less per unit.</w:t>
+        <w:t>A reproducible Python model multiplies quantities by published emission factors (Appendices A and C). Plant quantities come from the Ostrołęka project information sheet (BWRX-300 Ostrołęka sp. z o.o., 2023, as reported): 50,000 m³ of concrete and 14,000 t of steel per unit, a design proxy, not confirmed Darlington quantities. A bottom-up scaling (20,700 m³; Peterson, Zhao and Petroski, 2005) is a cross-check (Appendix A3). Granta EduPack cross-check. A Granta EduPack 2024 Eco Audit of one unit’s construction materials (120,000 t of concrete and 14,000 t of steel, with transport and steel recycling at end of life) gives 58,900 t CO₂e and 660 TJ for the first life, within about 2% of our scripted construction total of 57,600 t (Appendix A9, Figure F9). With the team’s LC³ material record (0.153 kg CO₂e/kg, against 0.158 for the base concrete), Granta’s saving is only about 240 t (−0.5%), because that record does not carry Pillai et al.’s (2019) 29% reduction; at Pillai’s 270 kg CO₂e/m³ (0.1125 kg/kg) the same model gives 2,200 t, matching our result. Granta also shows LC³’s embodied energy 33% lower per kilogram (0.60 against 0.90 MJ/kg), about 14 TJ less per unit. Back-calculating Sam’s records at 2,400 kg/m³ shows the base record equals Pillai’s ordinary concrete (380 kg CO₂e/m³) but the LC³ record equals 368 kg/m³, not Pillai’s 270; we therefore take 0.1125 kg CO₂e/kg as the defensible LC³ value, pending a Granta re-run. Five checks set in advance (Appendix A9.1): Granta and our model agree within 5% (pass, 2.3%); the mass balances close (pass); LC³’s cut of 28.9% sits just below the published 30–40% (marginal fail); our median of 4.40 g CO₂e/kWh sits below UNECE’s 5.1–6.4, although the 90% interval overlaps (fail on the median); and the Ontario industry concrete declaration was not tested. A Monte Carlo on the saving alone gives a median of 1,713 t per unit (90% interval 555–3,396 t); the LC³ factor and the eligible share explain about 86% of its variance.</w:t>
       </w:r>
     </w:p>
     <w:p>
@@ -16331,7 +16331,7 @@
       </w:r>
       <w:r>
         <w:rPr/>
-        <w:t xml:space="preserve"> It saves 2,200 t per unit (1,100–3,300; Section 3.1.4), about 0.36% of the life cycle; a delay of 11.6–18.5 days cancels it (1.7–1.8 days on the marginal grid factor).</w:t>
+        <w:t xml:space="preserve"> It saves 2,200 t per unit (1,100–3,300; Section 3.1.4), about 0.36% of the life cycle; a delay of 11.6–18.5 days cancels it (1.7–1.8 days on the marginal grid factor). Granta EduPack confirms the construction footprint within 2.3%, but with the team’s LC³ record it shows only about 240 t, so C1’s carbon case is marginal and uncertain (Monte Carlo 555–3,396 t); its firmer benefits are a 33% lower embodied energy per kilogram, a qualified precedent for low-clinker nuclear concrete, and keeping it off the critical path. The fuel front end matters far more to the plant’s footprint than concrete.</w:t>
       </w:r>
     </w:p>
     <w:p>
@@ -23493,6 +23493,900 @@
       <w:r>
         <w:rPr/>
         <w:t>Figure F10. Granta EduPack Eco Audit summary, energy (MJ) by life phase: base reactor against LC³ reactor. Source: Granta EduPack 2024 R1, team model.</w:t>
+      </w:r>
+    </w:p>
+    <w:p>
+      <w:pPr>
+        <w:pStyle w:val="Heading4"/>
+        <w:rPr/>
+      </w:pPr>
+      <w:r>
+        <w:rPr/>
+        <w:t>A9.1 Reconciliation and verification checks</w:t>
+      </w:r>
+    </w:p>
+    <w:p>
+      <w:pPr>
+        <w:pStyle w:val="FirstParagraph"/>
+        <w:rPr/>
+      </w:pPr>
+      <w:r>
+        <w:rPr/>
+        <w:t xml:space="preserve">Back-calculated at 2,400 kg/m³ (the density implied by 120,000 t for 50,000 m³), the base record (0.1583 kg/kg) equals Pillai et al.’s (2019) ordinary concrete, 380 kg CO₂e/m³, but the LC³ record (0.1533 kg/kg) equals 368 kg/m³, a 3.2% cut rather than Pillai’s 28.9%. The source of 0.1533 is not recorded in the reports. The defensible value, on the same source and density basis as the base record, is 270 / 2,400 = 0.1125 kg CO₂e/kg; the embodied energy of 0.603 MJ/kg is kept as entered. Both mixes are M50 (28-day mean strengths 60.0 and 56.7 MPa), so the per-m³ comparison is at the same strength class; whether OPG’s baseline mix already contains slag is not known, which would reduce the saving. Granta has no use phase, so its 30-year product life does not change its construction totals; the per-kWh figures use our 60-year functional unit (Script: </w:t>
+      </w:r>
+      <w:r>
+        <w:rPr>
+          <w:rStyle w:val="VerbatimChar"/>
+        </w:rPr>
+        <w:t>03_LCA_Calculations/scripts/granta_reconcile.py</w:t>
+      </w:r>
+      <w:r>
+        <w:rPr/>
+        <w:t>).</w:t>
+      </w:r>
+    </w:p>
+    <w:p>
+      <w:pPr>
+        <w:pStyle w:val="BodyText"/>
+        <w:rPr/>
+      </w:pPr>
+      <w:r>
+        <w:rPr>
+          <w:i/>
+          <w:iCs/>
+        </w:rPr>
+        <w:t>Table A9.1. Checks set in advance and their outcomes.</w:t>
+      </w:r>
+      <w:r>
+        <w:rPr/>
+        <w:t xml:space="preserve"> </w:t>
+      </w:r>
+      <w:r>
+        <w:rPr>
+          <w:i/>
+          <w:iCs/>
+        </w:rPr>
+        <w:t>Source: this study; Granta EduPack 2024 R1; Pillai et al. (2019); UNECE (2021).</w:t>
+      </w:r>
+    </w:p>
+    <w:tbl>
+      <w:tblPr>
+        <w:tblStyle w:val="Table"/>
+        <w:tblW w:w="7920" w:type="dxa"/>
+        <w:jc w:val="left"/>
+        <w:tblInd w:w="0" w:type="dxa"/>
+        <w:tblBorders>
+          <w:top w:val="single" w:sz="8" w:space="0" w:color="000000"/>
+          <w:left w:val="single" w:sz="8" w:space="0" w:color="000000"/>
+          <w:bottom w:val="single" w:sz="8" w:space="0" w:color="000000"/>
+          <w:right w:val="single" w:sz="8" w:space="0" w:color="000000"/>
+          <w:insideH w:val="single" w:sz="8" w:space="0" w:color="000000"/>
+          <w:insideV w:val="single" w:sz="8" w:space="0" w:color="000000"/>
+        </w:tblBorders>
+        <w:tblLayout w:type="fixed"/>
+        <w:tblCellMar>
+          <w:top w:w="30" w:type="dxa"/>
+          <w:left w:w="80" w:type="dxa"/>
+          <w:bottom w:w="30" w:type="dxa"/>
+          <w:right w:w="80" w:type="dxa"/>
+        </w:tblCellMar>
+        <w:tblLook w:val="0020" w:noHBand="0" w:noVBand="0" w:firstColumn="0" w:lastRow="0" w:lastColumn="0" w:firstRow="1"/>
+      </w:tblPr>
+      <w:tblGrid>
+        <w:gridCol w:w="1980"/>
+        <w:gridCol w:w="1980"/>
+        <w:gridCol w:w="1980"/>
+        <w:gridCol w:w="1979"/>
+      </w:tblGrid>
+      <w:tr>
+        <w:trPr>
+          <w:tblHeader w:val="true"/>
+        </w:trPr>
+        <w:tc>
+          <w:tcPr>
+            <w:tcW w:w="1980" w:type="dxa"/>
+            <w:tcBorders>
+              <w:top w:val="single" w:sz="8" w:space="0" w:color="000000"/>
+              <w:left w:val="single" w:sz="8" w:space="0" w:color="000000"/>
+              <w:bottom w:val="single" w:sz="8" w:space="0" w:color="000000"/>
+              <w:right w:val="single" w:sz="8" w:space="0" w:color="000000"/>
+            </w:tcBorders>
+            <w:shd w:color="auto" w:fill="EDEDED" w:val="clear"/>
+          </w:tcPr>
+          <w:p>
+            <w:pPr>
+              <w:pStyle w:val="Compact"/>
+              <w:widowControl/>
+              <w:spacing w:lineRule="auto" w:line="276" w:before="36" w:after="36"/>
+              <w:jc w:val="left"/>
+              <w:rPr>
+                <w:rFonts w:ascii="Aptos" w:hAnsi="Aptos" w:eastAsia="Aptos" w:cs="Aptos"/>
+                <w:b/>
+                <w:kern w:val="0"/>
+                <w:lang w:val="en-US"/>
+              </w:rPr>
+            </w:pPr>
+            <w:r>
+              <w:rPr>
+                <w:rFonts w:eastAsia="Aptos" w:cs="Aptos"/>
+                <w:b/>
+                <w:kern w:val="0"/>
+                <w:lang w:val="en-US"/>
+              </w:rPr>
+              <w:t>Check</w:t>
+            </w:r>
+          </w:p>
+        </w:tc>
+        <w:tc>
+          <w:tcPr>
+            <w:tcW w:w="1980" w:type="dxa"/>
+            <w:tcBorders>
+              <w:top w:val="single" w:sz="8" w:space="0" w:color="000000"/>
+              <w:left w:val="single" w:sz="8" w:space="0" w:color="000000"/>
+              <w:bottom w:val="single" w:sz="8" w:space="0" w:color="000000"/>
+              <w:right w:val="single" w:sz="8" w:space="0" w:color="000000"/>
+            </w:tcBorders>
+            <w:shd w:color="auto" w:fill="EDEDED" w:val="clear"/>
+          </w:tcPr>
+          <w:p>
+            <w:pPr>
+              <w:pStyle w:val="Compact"/>
+              <w:widowControl/>
+              <w:spacing w:lineRule="auto" w:line="276" w:before="36" w:after="36"/>
+              <w:jc w:val="left"/>
+              <w:rPr>
+                <w:rFonts w:ascii="Aptos" w:hAnsi="Aptos" w:eastAsia="Aptos" w:cs="Aptos"/>
+                <w:b/>
+                <w:kern w:val="0"/>
+                <w:lang w:val="en-US"/>
+              </w:rPr>
+            </w:pPr>
+            <w:r>
+              <w:rPr>
+                <w:rFonts w:eastAsia="Aptos" w:cs="Aptos"/>
+                <w:b/>
+                <w:kern w:val="0"/>
+                <w:lang w:val="en-US"/>
+              </w:rPr>
+              <w:t>Limit</w:t>
+            </w:r>
+          </w:p>
+        </w:tc>
+        <w:tc>
+          <w:tcPr>
+            <w:tcW w:w="1980" w:type="dxa"/>
+            <w:tcBorders>
+              <w:top w:val="single" w:sz="8" w:space="0" w:color="000000"/>
+              <w:left w:val="single" w:sz="8" w:space="0" w:color="000000"/>
+              <w:bottom w:val="single" w:sz="8" w:space="0" w:color="000000"/>
+              <w:right w:val="single" w:sz="8" w:space="0" w:color="000000"/>
+            </w:tcBorders>
+            <w:shd w:color="auto" w:fill="EDEDED" w:val="clear"/>
+          </w:tcPr>
+          <w:p>
+            <w:pPr>
+              <w:pStyle w:val="Compact"/>
+              <w:widowControl/>
+              <w:spacing w:lineRule="auto" w:line="276" w:before="36" w:after="36"/>
+              <w:jc w:val="left"/>
+              <w:rPr>
+                <w:rFonts w:ascii="Aptos" w:hAnsi="Aptos" w:eastAsia="Aptos" w:cs="Aptos"/>
+                <w:b/>
+                <w:kern w:val="0"/>
+                <w:lang w:val="en-US"/>
+              </w:rPr>
+            </w:pPr>
+            <w:r>
+              <w:rPr>
+                <w:rFonts w:eastAsia="Aptos" w:cs="Aptos"/>
+                <w:b/>
+                <w:kern w:val="0"/>
+                <w:lang w:val="en-US"/>
+              </w:rPr>
+              <w:t>Result</w:t>
+            </w:r>
+          </w:p>
+        </w:tc>
+        <w:tc>
+          <w:tcPr>
+            <w:tcW w:w="1979" w:type="dxa"/>
+            <w:tcBorders>
+              <w:top w:val="single" w:sz="8" w:space="0" w:color="000000"/>
+              <w:left w:val="single" w:sz="8" w:space="0" w:color="000000"/>
+              <w:bottom w:val="single" w:sz="8" w:space="0" w:color="000000"/>
+              <w:right w:val="single" w:sz="8" w:space="0" w:color="000000"/>
+            </w:tcBorders>
+            <w:shd w:color="auto" w:fill="EDEDED" w:val="clear"/>
+          </w:tcPr>
+          <w:p>
+            <w:pPr>
+              <w:pStyle w:val="Compact"/>
+              <w:widowControl/>
+              <w:spacing w:lineRule="auto" w:line="276" w:before="36" w:after="36"/>
+              <w:jc w:val="left"/>
+              <w:rPr>
+                <w:rFonts w:ascii="Aptos" w:hAnsi="Aptos" w:eastAsia="Aptos" w:cs="Aptos"/>
+                <w:b/>
+                <w:kern w:val="0"/>
+                <w:lang w:val="en-US"/>
+              </w:rPr>
+            </w:pPr>
+            <w:r>
+              <w:rPr>
+                <w:rFonts w:eastAsia="Aptos" w:cs="Aptos"/>
+                <w:b/>
+                <w:kern w:val="0"/>
+                <w:lang w:val="en-US"/>
+              </w:rPr>
+              <w:t>Outcome</w:t>
+            </w:r>
+          </w:p>
+        </w:tc>
+      </w:tr>
+      <w:tr>
+        <w:trPr/>
+        <w:tc>
+          <w:tcPr>
+            <w:tcW w:w="1980" w:type="dxa"/>
+            <w:tcBorders>
+              <w:top w:val="single" w:sz="8" w:space="0" w:color="000000"/>
+              <w:left w:val="single" w:sz="8" w:space="0" w:color="000000"/>
+              <w:bottom w:val="single" w:sz="8" w:space="0" w:color="000000"/>
+              <w:right w:val="single" w:sz="8" w:space="0" w:color="000000"/>
+            </w:tcBorders>
+          </w:tcPr>
+          <w:p>
+            <w:pPr>
+              <w:pStyle w:val="Compact"/>
+              <w:widowControl/>
+              <w:spacing w:lineRule="auto" w:line="276" w:before="36" w:after="36"/>
+              <w:jc w:val="left"/>
+              <w:rPr>
+                <w:rFonts w:ascii="Aptos" w:hAnsi="Aptos" w:eastAsia="Aptos" w:cs="Aptos"/>
+                <w:kern w:val="0"/>
+                <w:lang w:val="en-US"/>
+              </w:rPr>
+            </w:pPr>
+            <w:r>
+              <w:rPr>
+                <w:rFonts w:eastAsia="Aptos" w:cs="Aptos"/>
+                <w:kern w:val="0"/>
+                <w:lang w:val="en-US"/>
+              </w:rPr>
+              <w:t>Granta vs our model, construction total</w:t>
+            </w:r>
+          </w:p>
+        </w:tc>
+        <w:tc>
+          <w:tcPr>
+            <w:tcW w:w="1980" w:type="dxa"/>
+            <w:tcBorders>
+              <w:top w:val="single" w:sz="8" w:space="0" w:color="000000"/>
+              <w:left w:val="single" w:sz="8" w:space="0" w:color="000000"/>
+              <w:bottom w:val="single" w:sz="8" w:space="0" w:color="000000"/>
+              <w:right w:val="single" w:sz="8" w:space="0" w:color="000000"/>
+            </w:tcBorders>
+          </w:tcPr>
+          <w:p>
+            <w:pPr>
+              <w:pStyle w:val="Compact"/>
+              <w:widowControl/>
+              <w:spacing w:lineRule="auto" w:line="276" w:before="36" w:after="36"/>
+              <w:jc w:val="left"/>
+              <w:rPr>
+                <w:rFonts w:ascii="Aptos" w:hAnsi="Aptos" w:eastAsia="Aptos" w:cs="Aptos"/>
+                <w:kern w:val="0"/>
+                <w:lang w:val="en-US"/>
+              </w:rPr>
+            </w:pPr>
+            <w:r>
+              <w:rPr>
+                <w:rFonts w:eastAsia="Aptos" w:cs="Aptos"/>
+                <w:kern w:val="0"/>
+                <w:lang w:val="en-US"/>
+              </w:rPr>
+              <w:t>within 5%</w:t>
+            </w:r>
+          </w:p>
+        </w:tc>
+        <w:tc>
+          <w:tcPr>
+            <w:tcW w:w="1980" w:type="dxa"/>
+            <w:tcBorders>
+              <w:top w:val="single" w:sz="8" w:space="0" w:color="000000"/>
+              <w:left w:val="single" w:sz="8" w:space="0" w:color="000000"/>
+              <w:bottom w:val="single" w:sz="8" w:space="0" w:color="000000"/>
+              <w:right w:val="single" w:sz="8" w:space="0" w:color="000000"/>
+            </w:tcBorders>
+          </w:tcPr>
+          <w:p>
+            <w:pPr>
+              <w:pStyle w:val="Compact"/>
+              <w:widowControl/>
+              <w:spacing w:lineRule="auto" w:line="276" w:before="36" w:after="36"/>
+              <w:jc w:val="left"/>
+              <w:rPr>
+                <w:rFonts w:ascii="Aptos" w:hAnsi="Aptos" w:eastAsia="Aptos" w:cs="Aptos"/>
+                <w:kern w:val="0"/>
+                <w:lang w:val="en-US"/>
+              </w:rPr>
+            </w:pPr>
+            <w:r>
+              <w:rPr>
+                <w:rFonts w:eastAsia="Aptos" w:cs="Aptos"/>
+                <w:kern w:val="0"/>
+                <w:lang w:val="en-US"/>
+              </w:rPr>
+              <w:t>58,900 vs 57,600 t (2.3%)</w:t>
+            </w:r>
+          </w:p>
+        </w:tc>
+        <w:tc>
+          <w:tcPr>
+            <w:tcW w:w="1979" w:type="dxa"/>
+            <w:tcBorders>
+              <w:top w:val="single" w:sz="8" w:space="0" w:color="000000"/>
+              <w:left w:val="single" w:sz="8" w:space="0" w:color="000000"/>
+              <w:bottom w:val="single" w:sz="8" w:space="0" w:color="000000"/>
+              <w:right w:val="single" w:sz="8" w:space="0" w:color="000000"/>
+            </w:tcBorders>
+          </w:tcPr>
+          <w:p>
+            <w:pPr>
+              <w:pStyle w:val="Compact"/>
+              <w:widowControl/>
+              <w:spacing w:lineRule="auto" w:line="276" w:before="36" w:after="36"/>
+              <w:jc w:val="left"/>
+              <w:rPr>
+                <w:rFonts w:ascii="Aptos" w:hAnsi="Aptos" w:eastAsia="Aptos" w:cs="Aptos"/>
+                <w:kern w:val="0"/>
+                <w:lang w:val="en-US"/>
+              </w:rPr>
+            </w:pPr>
+            <w:r>
+              <w:rPr>
+                <w:rFonts w:eastAsia="Aptos" w:cs="Aptos"/>
+                <w:kern w:val="0"/>
+                <w:lang w:val="en-US"/>
+              </w:rPr>
+              <w:t>Pass</w:t>
+            </w:r>
+          </w:p>
+        </w:tc>
+      </w:tr>
+      <w:tr>
+        <w:trPr/>
+        <w:tc>
+          <w:tcPr>
+            <w:tcW w:w="1980" w:type="dxa"/>
+            <w:tcBorders>
+              <w:top w:val="single" w:sz="8" w:space="0" w:color="000000"/>
+              <w:left w:val="single" w:sz="8" w:space="0" w:color="000000"/>
+              <w:bottom w:val="single" w:sz="8" w:space="0" w:color="000000"/>
+              <w:right w:val="single" w:sz="8" w:space="0" w:color="000000"/>
+            </w:tcBorders>
+          </w:tcPr>
+          <w:p>
+            <w:pPr>
+              <w:pStyle w:val="Compact"/>
+              <w:widowControl/>
+              <w:spacing w:lineRule="auto" w:line="276" w:before="36" w:after="36"/>
+              <w:jc w:val="left"/>
+              <w:rPr>
+                <w:rFonts w:ascii="Aptos" w:hAnsi="Aptos" w:eastAsia="Aptos" w:cs="Aptos"/>
+                <w:kern w:val="0"/>
+                <w:lang w:val="en-US"/>
+              </w:rPr>
+            </w:pPr>
+            <w:r>
+              <w:rPr>
+                <w:rFonts w:eastAsia="Aptos" w:cs="Aptos"/>
+                <w:kern w:val="0"/>
+                <w:lang w:val="en-US"/>
+              </w:rPr>
+              <w:t>LC³ cut against ordinary concrete</w:t>
+            </w:r>
+          </w:p>
+        </w:tc>
+        <w:tc>
+          <w:tcPr>
+            <w:tcW w:w="1980" w:type="dxa"/>
+            <w:tcBorders>
+              <w:top w:val="single" w:sz="8" w:space="0" w:color="000000"/>
+              <w:left w:val="single" w:sz="8" w:space="0" w:color="000000"/>
+              <w:bottom w:val="single" w:sz="8" w:space="0" w:color="000000"/>
+              <w:right w:val="single" w:sz="8" w:space="0" w:color="000000"/>
+            </w:tcBorders>
+          </w:tcPr>
+          <w:p>
+            <w:pPr>
+              <w:pStyle w:val="Compact"/>
+              <w:widowControl/>
+              <w:spacing w:lineRule="auto" w:line="276" w:before="36" w:after="36"/>
+              <w:jc w:val="left"/>
+              <w:rPr>
+                <w:rFonts w:ascii="Aptos" w:hAnsi="Aptos" w:eastAsia="Aptos" w:cs="Aptos"/>
+                <w:kern w:val="0"/>
+                <w:lang w:val="en-US"/>
+              </w:rPr>
+            </w:pPr>
+            <w:r>
+              <w:rPr>
+                <w:rFonts w:eastAsia="Aptos" w:cs="Aptos"/>
+                <w:kern w:val="0"/>
+                <w:lang w:val="en-US"/>
+              </w:rPr>
+              <w:t>30–40%</w:t>
+            </w:r>
+          </w:p>
+        </w:tc>
+        <w:tc>
+          <w:tcPr>
+            <w:tcW w:w="1980" w:type="dxa"/>
+            <w:tcBorders>
+              <w:top w:val="single" w:sz="8" w:space="0" w:color="000000"/>
+              <w:left w:val="single" w:sz="8" w:space="0" w:color="000000"/>
+              <w:bottom w:val="single" w:sz="8" w:space="0" w:color="000000"/>
+              <w:right w:val="single" w:sz="8" w:space="0" w:color="000000"/>
+            </w:tcBorders>
+          </w:tcPr>
+          <w:p>
+            <w:pPr>
+              <w:pStyle w:val="Compact"/>
+              <w:widowControl/>
+              <w:spacing w:lineRule="auto" w:line="276" w:before="36" w:after="36"/>
+              <w:jc w:val="left"/>
+              <w:rPr>
+                <w:rFonts w:ascii="Aptos" w:hAnsi="Aptos" w:eastAsia="Aptos" w:cs="Aptos"/>
+                <w:kern w:val="0"/>
+                <w:lang w:val="en-US"/>
+              </w:rPr>
+            </w:pPr>
+            <w:r>
+              <w:rPr>
+                <w:rFonts w:eastAsia="Aptos" w:cs="Aptos"/>
+                <w:kern w:val="0"/>
+                <w:lang w:val="en-US"/>
+              </w:rPr>
+              <w:t>Pillai 28.9%; Granta record 3.2%</w:t>
+            </w:r>
+          </w:p>
+        </w:tc>
+        <w:tc>
+          <w:tcPr>
+            <w:tcW w:w="1979" w:type="dxa"/>
+            <w:tcBorders>
+              <w:top w:val="single" w:sz="8" w:space="0" w:color="000000"/>
+              <w:left w:val="single" w:sz="8" w:space="0" w:color="000000"/>
+              <w:bottom w:val="single" w:sz="8" w:space="0" w:color="000000"/>
+              <w:right w:val="single" w:sz="8" w:space="0" w:color="000000"/>
+            </w:tcBorders>
+          </w:tcPr>
+          <w:p>
+            <w:pPr>
+              <w:pStyle w:val="Compact"/>
+              <w:widowControl/>
+              <w:spacing w:lineRule="auto" w:line="276" w:before="36" w:after="36"/>
+              <w:jc w:val="left"/>
+              <w:rPr>
+                <w:rFonts w:ascii="Aptos" w:hAnsi="Aptos" w:eastAsia="Aptos" w:cs="Aptos"/>
+                <w:kern w:val="0"/>
+                <w:lang w:val="en-US"/>
+              </w:rPr>
+            </w:pPr>
+            <w:r>
+              <w:rPr>
+                <w:rFonts w:eastAsia="Aptos" w:cs="Aptos"/>
+                <w:kern w:val="0"/>
+                <w:lang w:val="en-US"/>
+              </w:rPr>
+              <w:t>Fail (marginal for Pillai)</w:t>
+            </w:r>
+          </w:p>
+        </w:tc>
+      </w:tr>
+      <w:tr>
+        <w:trPr/>
+        <w:tc>
+          <w:tcPr>
+            <w:tcW w:w="1980" w:type="dxa"/>
+            <w:tcBorders>
+              <w:top w:val="single" w:sz="8" w:space="0" w:color="000000"/>
+              <w:left w:val="single" w:sz="8" w:space="0" w:color="000000"/>
+              <w:bottom w:val="single" w:sz="8" w:space="0" w:color="000000"/>
+              <w:right w:val="single" w:sz="8" w:space="0" w:color="000000"/>
+            </w:tcBorders>
+          </w:tcPr>
+          <w:p>
+            <w:pPr>
+              <w:pStyle w:val="Compact"/>
+              <w:widowControl/>
+              <w:spacing w:lineRule="auto" w:line="276" w:before="36" w:after="36"/>
+              <w:jc w:val="left"/>
+              <w:rPr>
+                <w:rFonts w:ascii="Aptos" w:hAnsi="Aptos" w:eastAsia="Aptos" w:cs="Aptos"/>
+                <w:kern w:val="0"/>
+                <w:lang w:val="en-US"/>
+              </w:rPr>
+            </w:pPr>
+            <w:r>
+              <w:rPr>
+                <w:rFonts w:eastAsia="Aptos" w:cs="Aptos"/>
+                <w:kern w:val="0"/>
+                <w:lang w:val="en-US"/>
+              </w:rPr>
+              <w:t>Ordinary concrete per m³ vs Ontario industry declaration</w:t>
+            </w:r>
+          </w:p>
+        </w:tc>
+        <w:tc>
+          <w:tcPr>
+            <w:tcW w:w="1980" w:type="dxa"/>
+            <w:tcBorders>
+              <w:top w:val="single" w:sz="8" w:space="0" w:color="000000"/>
+              <w:left w:val="single" w:sz="8" w:space="0" w:color="000000"/>
+              <w:bottom w:val="single" w:sz="8" w:space="0" w:color="000000"/>
+              <w:right w:val="single" w:sz="8" w:space="0" w:color="000000"/>
+            </w:tcBorders>
+          </w:tcPr>
+          <w:p>
+            <w:pPr>
+              <w:pStyle w:val="Compact"/>
+              <w:widowControl/>
+              <w:spacing w:lineRule="auto" w:line="276" w:before="36" w:after="36"/>
+              <w:jc w:val="left"/>
+              <w:rPr>
+                <w:rFonts w:ascii="Aptos" w:hAnsi="Aptos" w:eastAsia="Aptos" w:cs="Aptos"/>
+                <w:kern w:val="0"/>
+                <w:lang w:val="en-US"/>
+              </w:rPr>
+            </w:pPr>
+            <w:r>
+              <w:rPr>
+                <w:rFonts w:eastAsia="Aptos" w:cs="Aptos"/>
+                <w:kern w:val="0"/>
+                <w:lang w:val="en-US"/>
+              </w:rPr>
+              <w:t>within 15%</w:t>
+            </w:r>
+          </w:p>
+        </w:tc>
+        <w:tc>
+          <w:tcPr>
+            <w:tcW w:w="1980" w:type="dxa"/>
+            <w:tcBorders>
+              <w:top w:val="single" w:sz="8" w:space="0" w:color="000000"/>
+              <w:left w:val="single" w:sz="8" w:space="0" w:color="000000"/>
+              <w:bottom w:val="single" w:sz="8" w:space="0" w:color="000000"/>
+              <w:right w:val="single" w:sz="8" w:space="0" w:color="000000"/>
+            </w:tcBorders>
+          </w:tcPr>
+          <w:p>
+            <w:pPr>
+              <w:pStyle w:val="Compact"/>
+              <w:widowControl/>
+              <w:spacing w:lineRule="auto" w:line="276" w:before="36" w:after="36"/>
+              <w:jc w:val="left"/>
+              <w:rPr>
+                <w:rFonts w:ascii="Aptos" w:hAnsi="Aptos" w:eastAsia="Aptos" w:cs="Aptos"/>
+                <w:kern w:val="0"/>
+                <w:lang w:val="en-US"/>
+              </w:rPr>
+            </w:pPr>
+            <w:r>
+              <w:rPr>
+                <w:rFonts w:eastAsia="Aptos" w:cs="Aptos"/>
+                <w:kern w:val="0"/>
+                <w:lang w:val="en-US"/>
+              </w:rPr>
+              <w:t>not tested</w:t>
+            </w:r>
+          </w:p>
+        </w:tc>
+        <w:tc>
+          <w:tcPr>
+            <w:tcW w:w="1979" w:type="dxa"/>
+            <w:tcBorders>
+              <w:top w:val="single" w:sz="8" w:space="0" w:color="000000"/>
+              <w:left w:val="single" w:sz="8" w:space="0" w:color="000000"/>
+              <w:bottom w:val="single" w:sz="8" w:space="0" w:color="000000"/>
+              <w:right w:val="single" w:sz="8" w:space="0" w:color="000000"/>
+            </w:tcBorders>
+          </w:tcPr>
+          <w:p>
+            <w:pPr>
+              <w:pStyle w:val="Compact"/>
+              <w:widowControl/>
+              <w:spacing w:lineRule="auto" w:line="276" w:before="36" w:after="36"/>
+              <w:jc w:val="left"/>
+              <w:rPr>
+                <w:rFonts w:ascii="Aptos" w:hAnsi="Aptos" w:eastAsia="Aptos" w:cs="Aptos"/>
+                <w:kern w:val="0"/>
+                <w:lang w:val="en-US"/>
+              </w:rPr>
+            </w:pPr>
+            <w:r>
+              <w:rPr>
+                <w:rFonts w:eastAsia="Aptos" w:cs="Aptos"/>
+                <w:kern w:val="0"/>
+                <w:lang w:val="en-US"/>
+              </w:rPr>
+              <w:t>Not tested</w:t>
+            </w:r>
+          </w:p>
+        </w:tc>
+      </w:tr>
+      <w:tr>
+        <w:trPr/>
+        <w:tc>
+          <w:tcPr>
+            <w:tcW w:w="1980" w:type="dxa"/>
+            <w:tcBorders>
+              <w:top w:val="single" w:sz="8" w:space="0" w:color="000000"/>
+              <w:left w:val="single" w:sz="8" w:space="0" w:color="000000"/>
+              <w:bottom w:val="single" w:sz="8" w:space="0" w:color="000000"/>
+              <w:right w:val="single" w:sz="8" w:space="0" w:color="000000"/>
+            </w:tcBorders>
+          </w:tcPr>
+          <w:p>
+            <w:pPr>
+              <w:pStyle w:val="Compact"/>
+              <w:widowControl/>
+              <w:spacing w:lineRule="auto" w:line="276" w:before="36" w:after="36"/>
+              <w:jc w:val="left"/>
+              <w:rPr>
+                <w:rFonts w:ascii="Aptos" w:hAnsi="Aptos" w:eastAsia="Aptos" w:cs="Aptos"/>
+                <w:kern w:val="0"/>
+                <w:lang w:val="en-US"/>
+              </w:rPr>
+            </w:pPr>
+            <w:r>
+              <w:rPr>
+                <w:rFonts w:eastAsia="Aptos" w:cs="Aptos"/>
+                <w:kern w:val="0"/>
+                <w:lang w:val="en-US"/>
+              </w:rPr>
+              <w:t>Whole-plant intensity vs UNECE</w:t>
+            </w:r>
+          </w:p>
+        </w:tc>
+        <w:tc>
+          <w:tcPr>
+            <w:tcW w:w="1980" w:type="dxa"/>
+            <w:tcBorders>
+              <w:top w:val="single" w:sz="8" w:space="0" w:color="000000"/>
+              <w:left w:val="single" w:sz="8" w:space="0" w:color="000000"/>
+              <w:bottom w:val="single" w:sz="8" w:space="0" w:color="000000"/>
+              <w:right w:val="single" w:sz="8" w:space="0" w:color="000000"/>
+            </w:tcBorders>
+          </w:tcPr>
+          <w:p>
+            <w:pPr>
+              <w:pStyle w:val="Compact"/>
+              <w:widowControl/>
+              <w:spacing w:lineRule="auto" w:line="276" w:before="36" w:after="36"/>
+              <w:jc w:val="left"/>
+              <w:rPr>
+                <w:rFonts w:ascii="Aptos" w:hAnsi="Aptos" w:eastAsia="Aptos" w:cs="Aptos"/>
+                <w:kern w:val="0"/>
+                <w:lang w:val="en-US"/>
+              </w:rPr>
+            </w:pPr>
+            <w:r>
+              <w:rPr>
+                <w:rFonts w:eastAsia="Aptos" w:cs="Aptos"/>
+                <w:kern w:val="0"/>
+                <w:lang w:val="en-US"/>
+              </w:rPr>
+              <w:t>5.1–6.4 g/kWh</w:t>
+            </w:r>
+          </w:p>
+        </w:tc>
+        <w:tc>
+          <w:tcPr>
+            <w:tcW w:w="1980" w:type="dxa"/>
+            <w:tcBorders>
+              <w:top w:val="single" w:sz="8" w:space="0" w:color="000000"/>
+              <w:left w:val="single" w:sz="8" w:space="0" w:color="000000"/>
+              <w:bottom w:val="single" w:sz="8" w:space="0" w:color="000000"/>
+              <w:right w:val="single" w:sz="8" w:space="0" w:color="000000"/>
+            </w:tcBorders>
+          </w:tcPr>
+          <w:p>
+            <w:pPr>
+              <w:pStyle w:val="Compact"/>
+              <w:widowControl/>
+              <w:spacing w:lineRule="auto" w:line="276" w:before="36" w:after="36"/>
+              <w:jc w:val="left"/>
+              <w:rPr>
+                <w:rFonts w:ascii="Aptos" w:hAnsi="Aptos" w:eastAsia="Aptos" w:cs="Aptos"/>
+                <w:kern w:val="0"/>
+                <w:lang w:val="en-US"/>
+              </w:rPr>
+            </w:pPr>
+            <w:r>
+              <w:rPr>
+                <w:rFonts w:eastAsia="Aptos" w:cs="Aptos"/>
+                <w:kern w:val="0"/>
+                <w:lang w:val="en-US"/>
+              </w:rPr>
+              <w:t>median 4.40 (90%: 3.24–6.05)</w:t>
+            </w:r>
+          </w:p>
+        </w:tc>
+        <w:tc>
+          <w:tcPr>
+            <w:tcW w:w="1979" w:type="dxa"/>
+            <w:tcBorders>
+              <w:top w:val="single" w:sz="8" w:space="0" w:color="000000"/>
+              <w:left w:val="single" w:sz="8" w:space="0" w:color="000000"/>
+              <w:bottom w:val="single" w:sz="8" w:space="0" w:color="000000"/>
+              <w:right w:val="single" w:sz="8" w:space="0" w:color="000000"/>
+            </w:tcBorders>
+          </w:tcPr>
+          <w:p>
+            <w:pPr>
+              <w:pStyle w:val="Compact"/>
+              <w:widowControl/>
+              <w:spacing w:lineRule="auto" w:line="276" w:before="36" w:after="36"/>
+              <w:jc w:val="left"/>
+              <w:rPr>
+                <w:rFonts w:ascii="Aptos" w:hAnsi="Aptos" w:eastAsia="Aptos" w:cs="Aptos"/>
+                <w:kern w:val="0"/>
+                <w:lang w:val="en-US"/>
+              </w:rPr>
+            </w:pPr>
+            <w:r>
+              <w:rPr>
+                <w:rFonts w:eastAsia="Aptos" w:cs="Aptos"/>
+                <w:kern w:val="0"/>
+                <w:lang w:val="en-US"/>
+              </w:rPr>
+              <w:t>Fail on median; interval overlaps</w:t>
+            </w:r>
+          </w:p>
+        </w:tc>
+      </w:tr>
+      <w:tr>
+        <w:trPr/>
+        <w:tc>
+          <w:tcPr>
+            <w:tcW w:w="1980" w:type="dxa"/>
+            <w:tcBorders>
+              <w:top w:val="single" w:sz="8" w:space="0" w:color="000000"/>
+              <w:left w:val="single" w:sz="8" w:space="0" w:color="000000"/>
+              <w:bottom w:val="single" w:sz="8" w:space="0" w:color="000000"/>
+              <w:right w:val="single" w:sz="8" w:space="0" w:color="000000"/>
+            </w:tcBorders>
+          </w:tcPr>
+          <w:p>
+            <w:pPr>
+              <w:pStyle w:val="Compact"/>
+              <w:widowControl/>
+              <w:spacing w:lineRule="auto" w:line="276" w:before="36" w:after="36"/>
+              <w:jc w:val="left"/>
+              <w:rPr>
+                <w:rFonts w:ascii="Aptos" w:hAnsi="Aptos" w:eastAsia="Aptos" w:cs="Aptos"/>
+                <w:kern w:val="0"/>
+                <w:lang w:val="en-US"/>
+              </w:rPr>
+            </w:pPr>
+            <w:r>
+              <w:rPr>
+                <w:rFonts w:eastAsia="Aptos" w:cs="Aptos"/>
+                <w:kern w:val="0"/>
+                <w:lang w:val="en-US"/>
+              </w:rPr>
+              <w:t>Mass and energy balances</w:t>
+            </w:r>
+          </w:p>
+        </w:tc>
+        <w:tc>
+          <w:tcPr>
+            <w:tcW w:w="1980" w:type="dxa"/>
+            <w:tcBorders>
+              <w:top w:val="single" w:sz="8" w:space="0" w:color="000000"/>
+              <w:left w:val="single" w:sz="8" w:space="0" w:color="000000"/>
+              <w:bottom w:val="single" w:sz="8" w:space="0" w:color="000000"/>
+              <w:right w:val="single" w:sz="8" w:space="0" w:color="000000"/>
+            </w:tcBorders>
+          </w:tcPr>
+          <w:p>
+            <w:pPr>
+              <w:pStyle w:val="Compact"/>
+              <w:widowControl/>
+              <w:spacing w:lineRule="auto" w:line="276" w:before="36" w:after="36"/>
+              <w:jc w:val="left"/>
+              <w:rPr>
+                <w:rFonts w:ascii="Aptos" w:hAnsi="Aptos" w:eastAsia="Aptos" w:cs="Aptos"/>
+                <w:kern w:val="0"/>
+                <w:lang w:val="en-US"/>
+              </w:rPr>
+            </w:pPr>
+            <w:r>
+              <w:rPr>
+                <w:rFonts w:eastAsia="Aptos" w:cs="Aptos"/>
+                <w:kern w:val="0"/>
+                <w:lang w:val="en-US"/>
+              </w:rPr>
+              <w:t>close</w:t>
+            </w:r>
+          </w:p>
+        </w:tc>
+        <w:tc>
+          <w:tcPr>
+            <w:tcW w:w="1980" w:type="dxa"/>
+            <w:tcBorders>
+              <w:top w:val="single" w:sz="8" w:space="0" w:color="000000"/>
+              <w:left w:val="single" w:sz="8" w:space="0" w:color="000000"/>
+              <w:bottom w:val="single" w:sz="8" w:space="0" w:color="000000"/>
+              <w:right w:val="single" w:sz="8" w:space="0" w:color="000000"/>
+            </w:tcBorders>
+          </w:tcPr>
+          <w:p>
+            <w:pPr>
+              <w:pStyle w:val="Compact"/>
+              <w:widowControl/>
+              <w:spacing w:lineRule="auto" w:line="276" w:before="36" w:after="36"/>
+              <w:jc w:val="left"/>
+              <w:rPr>
+                <w:rFonts w:ascii="Aptos" w:hAnsi="Aptos" w:eastAsia="Aptos" w:cs="Aptos"/>
+                <w:kern w:val="0"/>
+                <w:lang w:val="en-US"/>
+              </w:rPr>
+            </w:pPr>
+            <w:r>
+              <w:rPr>
+                <w:rFonts w:eastAsia="Aptos" w:cs="Aptos"/>
+                <w:kern w:val="0"/>
+                <w:lang w:val="en-US"/>
+              </w:rPr>
+              <w:t>120,000 t; 72,000 + 48,000 t; steel 6,000 + 8,000 t; material energy within 2%</w:t>
+            </w:r>
+          </w:p>
+        </w:tc>
+        <w:tc>
+          <w:tcPr>
+            <w:tcW w:w="1979" w:type="dxa"/>
+            <w:tcBorders>
+              <w:top w:val="single" w:sz="8" w:space="0" w:color="000000"/>
+              <w:left w:val="single" w:sz="8" w:space="0" w:color="000000"/>
+              <w:bottom w:val="single" w:sz="8" w:space="0" w:color="000000"/>
+              <w:right w:val="single" w:sz="8" w:space="0" w:color="000000"/>
+            </w:tcBorders>
+          </w:tcPr>
+          <w:p>
+            <w:pPr>
+              <w:pStyle w:val="Compact"/>
+              <w:widowControl/>
+              <w:spacing w:lineRule="auto" w:line="276" w:before="36" w:after="36"/>
+              <w:jc w:val="left"/>
+              <w:rPr>
+                <w:rFonts w:ascii="Aptos" w:hAnsi="Aptos" w:eastAsia="Aptos" w:cs="Aptos"/>
+                <w:kern w:val="0"/>
+                <w:lang w:val="en-US"/>
+              </w:rPr>
+            </w:pPr>
+            <w:r>
+              <w:rPr>
+                <w:rFonts w:eastAsia="Aptos" w:cs="Aptos"/>
+                <w:kern w:val="0"/>
+                <w:lang w:val="en-US"/>
+              </w:rPr>
+              <w:t>Pass</w:t>
+            </w:r>
+          </w:p>
+        </w:tc>
+      </w:tr>
+    </w:tbl>
+    <w:p>
+      <w:pPr>
+        <w:pStyle w:val="BodyText"/>
+        <w:rPr/>
+      </w:pPr>
+      <w:r>
+        <w:rPr/>
+        <w:t>Monte Carlo on the C1 saving (20,000 draws, seed 20261025; eligible share uniform 20–60%; ordinary concrete 342–418 kg/m³; LC³ 230–368 kg/m³ with Sam’s record as the upper bound): median 1,713 t per unit, 90% interval 555–3,396 t. Share of variance: LC³ factor 48%, eligible share 38%, ordinary-concrete factor 14%.</w:t>
       </w:r>
     </w:p>
     <w:p>
@@ -29208,7 +30102,7 @@
     </w:r>
     <w:r>
       <w:rPr/>
-      <w:t>52</w:t>
+      <w:t>54</w:t>
     </w:r>
     <w:r>
       <w:rPr/>
@@ -29265,7 +30159,7 @@
     <w:r>
       <w:rPr/>
       <w:drawing>
-        <wp:anchor behindDoc="1" distT="0" distB="0" distL="0" distR="0" simplePos="0" locked="0" layoutInCell="0" allowOverlap="1" relativeHeight="64">
+        <wp:anchor behindDoc="1" distT="0" distB="0" distL="0" distR="0" simplePos="0" locked="0" layoutInCell="0" allowOverlap="1" relativeHeight="66">
           <wp:simplePos x="0" y="0"/>
           <wp:positionH relativeFrom="margin">
             <wp:posOffset>4845050</wp:posOffset>
@@ -29310,7 +30204,7 @@
         </wp:anchor>
       </w:drawing>
       <w:drawing>
-        <wp:anchor behindDoc="1" distT="0" distB="0" distL="0" distR="0" simplePos="0" locked="0" layoutInCell="0" allowOverlap="1" relativeHeight="117">
+        <wp:anchor behindDoc="1" distT="0" distB="0" distL="0" distR="0" simplePos="0" locked="0" layoutInCell="0" allowOverlap="1" relativeHeight="121">
           <wp:simplePos x="0" y="0"/>
           <wp:positionH relativeFrom="page">
             <wp:posOffset>752475</wp:posOffset>

</xml_diff>